<commit_message>
complete connect multi Mqtt device and export Excel
</commit_message>
<xml_diff>
--- a/docs/banTinModbus.docx
+++ b/docs/banTinModbus.docx
@@ -1,6 +1,6 @@
 
 <file path=word/document.xml><?xml version="1.0" encoding="utf-8"?>
-<w:document xmlns:wpc="http://schemas.microsoft.com/office/word/2010/wordprocessingCanvas" xmlns:cx="http://schemas.microsoft.com/office/drawing/2014/chartex" xmlns:cx1="http://schemas.microsoft.com/office/drawing/2015/9/8/chartex" xmlns:cx2="http://schemas.microsoft.com/office/drawing/2015/10/21/chartex" xmlns:cx3="http://schemas.microsoft.com/office/drawing/2016/5/9/chartex" xmlns:cx4="http://schemas.microsoft.com/office/drawing/2016/5/10/chartex" xmlns:cx5="http://schemas.microsoft.com/office/drawing/2016/5/11/chartex" xmlns:cx6="http://schemas.microsoft.com/office/drawing/2016/5/12/chartex" xmlns:cx7="http://schemas.microsoft.com/office/drawing/2016/5/13/chartex" xmlns:cx8="http://schemas.microsoft.com/office/drawing/2016/5/14/chartex" xmlns:mc="http://schemas.openxmlformats.org/markup-compatibility/2006" xmlns:aink="http://schemas.microsoft.com/office/drawing/2016/ink" xmlns:am3d="http://schemas.microsoft.com/office/drawing/2017/model3d" xmlns:o="urn:schemas-microsoft-com:office:office" xmlns:oel="http://schemas.microsoft.com/office/2019/extlst" xmlns:r="http://schemas.openxmlformats.org/officeDocument/2006/relationships" xmlns:m="http://schemas.openxmlformats.org/officeDocument/2006/math" xmlns:v="urn:schemas-microsoft-com:vml" xmlns:wp14="http://schemas.microsoft.com/office/word/2010/wordprocessingDrawing" xmlns:wp="http://schemas.openxmlformats.org/drawingml/2006/wordprocessingDrawing" xmlns:w10="urn:schemas-microsoft-com:office:word" xmlns:w="http://schemas.openxmlformats.org/wordprocessingml/2006/main" xmlns:w14="http://schemas.microsoft.com/office/word/2010/wordml" xmlns:w15="http://schemas.microsoft.com/office/word/2012/wordml" xmlns:w16cei="http://schemas.microsoft.com/office/word/2026/wordml/cei" xmlns:w16cex="http://schemas.microsoft.com/office/word/2018/wordml/cex" xmlns:w16cid="http://schemas.microsoft.com/office/word/2016/wordml/cid" xmlns:w16="http://schemas.microsoft.com/office/word/2018/wordml" xmlns:w16du="http://schemas.microsoft.com/office/word/2023/wordml/word16du" xmlns:w16sdtdh="http://schemas.microsoft.com/office/word/2020/wordml/sdtdatahash" xmlns:w16sdtfl="http://schemas.microsoft.com/office/word/2024/wordml/sdtformatlock" xmlns:w16se="http://schemas.microsoft.com/office/word/2015/wordml/symex" xmlns:wpg="http://schemas.microsoft.com/office/word/2010/wordprocessingGroup" xmlns:wpi="http://schemas.microsoft.com/office/word/2010/wordprocessingInk" xmlns:wne="http://schemas.microsoft.com/office/word/2006/wordml" xmlns:wps="http://schemas.microsoft.com/office/word/2010/wordprocessingShape" mc:Ignorable="w14 w15 w16se w16cid w16 w16cex w16sdtdh w16sdtfl w16du wp14">
+<w:document xmlns:wpc="http://schemas.microsoft.com/office/word/2010/wordprocessingCanvas" xmlns:cx="http://schemas.microsoft.com/office/drawing/2014/chartex" xmlns:cx1="http://schemas.microsoft.com/office/drawing/2015/9/8/chartex" xmlns:cx2="http://schemas.microsoft.com/office/drawing/2015/10/21/chartex" xmlns:cx3="http://schemas.microsoft.com/office/drawing/2016/5/9/chartex" xmlns:cx4="http://schemas.microsoft.com/office/drawing/2016/5/10/chartex" xmlns:cx5="http://schemas.microsoft.com/office/drawing/2016/5/11/chartex" xmlns:cx6="http://schemas.microsoft.com/office/drawing/2016/5/12/chartex" xmlns:cx7="http://schemas.microsoft.com/office/drawing/2016/5/13/chartex" xmlns:cx8="http://schemas.microsoft.com/office/drawing/2016/5/14/chartex" xmlns:mc="http://schemas.openxmlformats.org/markup-compatibility/2006" xmlns:aink="http://schemas.microsoft.com/office/drawing/2016/ink" xmlns:am3d="http://schemas.microsoft.com/office/drawing/2017/model3d" xmlns:o="urn:schemas-microsoft-com:office:office" xmlns:oel="http://schemas.microsoft.com/office/2019/extlst" xmlns:r="http://schemas.openxmlformats.org/officeDocument/2006/relationships" xmlns:m="http://schemas.openxmlformats.org/officeDocument/2006/math" xmlns:v="urn:schemas-microsoft-com:vml" xmlns:wp14="http://schemas.microsoft.com/office/word/2010/wordprocessingDrawing" xmlns:wp="http://schemas.openxmlformats.org/drawingml/2006/wordprocessingDrawing" xmlns:w10="urn:schemas-microsoft-com:office:word" xmlns:w="http://schemas.openxmlformats.org/wordprocessingml/2006/main" xmlns:w14="http://schemas.microsoft.com/office/word/2010/wordml" xmlns:w15="http://schemas.microsoft.com/office/word/2012/wordml" xmlns:w16cex="http://schemas.microsoft.com/office/word/2018/wordml/cex" xmlns:w16cid="http://schemas.microsoft.com/office/word/2016/wordml/cid" xmlns:w16="http://schemas.microsoft.com/office/word/2018/wordml" xmlns:w16sdtdh="http://schemas.microsoft.com/office/word/2020/wordml/sdtdatahash" xmlns:w16se="http://schemas.microsoft.com/office/word/2015/wordml/symex" xmlns:wpg="http://schemas.microsoft.com/office/word/2010/wordprocessingGroup" xmlns:wpi="http://schemas.microsoft.com/office/word/2010/wordprocessingInk" xmlns:wne="http://schemas.microsoft.com/office/word/2006/wordml" xmlns:wps="http://schemas.microsoft.com/office/word/2010/wordprocessingShape" mc:Ignorable="w14 w15 w16se w16cid w16 w16cex w16sdtdh wp14">
   <w:body>
     <w:p>
       <w:pPr>
@@ -118,15 +118,25 @@
           <w:rFonts w:ascii="Times New Roman" w:hAnsi="Times New Roman" w:cs="Times New Roman"/>
           <w:sz w:val="26"/>
           <w:szCs w:val="26"/>
-        </w:rPr>
-      </w:pPr>
-      <w:r>
-        <w:rPr>
-          <w:rFonts w:ascii="Times New Roman" w:hAnsi="Times New Roman" w:cs="Times New Roman"/>
-          <w:sz w:val="26"/>
-          <w:szCs w:val="26"/>
-        </w:rPr>
-        <w:t>{"Tdo":28.5,"Hdo":55.0,"Tgian":3.2,"NguongAmSmt":55.5,"NguongNhietCON":28.5,"Running Status":"SYS_RUNNING","Running Mode":"SMART","Water Tank Status":"OK","Sensor Error":0}\r\n</w:t>
+          <w:lang w:val="vi-VN"/>
+        </w:rPr>
+      </w:pPr>
+      <w:r>
+        <w:rPr>
+          <w:rFonts w:ascii="Times New Roman" w:hAnsi="Times New Roman" w:cs="Times New Roman"/>
+          <w:sz w:val="26"/>
+          <w:szCs w:val="26"/>
+          <w:lang w:val="vi-VN"/>
+        </w:rPr>
+        <w:t>{"Tdo":28.4,"Hdo":85.4,"Tgian":17.6,"NguongAmSmt":70.0,"NguongNhietCON":13.4,"Running Status":SYS_RUNNING,"Running Mode":SMART,"Water Tank Status":OK,"Sensor Error":0,"Loc Status":1,"Fan Status":1,"Heater Status":0}</w:t>
+      </w:r>
+      <w:r>
+        <w:rPr>
+          <w:rFonts w:ascii="Times New Roman" w:hAnsi="Times New Roman" w:cs="Times New Roman"/>
+          <w:sz w:val="26"/>
+          <w:szCs w:val="26"/>
+        </w:rPr>
+        <w:t>r\n</w:t>
       </w:r>
     </w:p>
     <w:p>
@@ -1829,6 +1839,441 @@
           </w:p>
         </w:tc>
       </w:tr>
+      <w:tr>
+        <w:trPr>
+          <w:tblCellSpacing w:w="15" w:type="dxa"/>
+        </w:trPr>
+        <w:tc>
+          <w:tcPr>
+            <w:tcW w:w="0" w:type="auto"/>
+            <w:tcBorders>
+              <w:top w:val="single" w:sz="6" w:space="0" w:color="C4C7C5"/>
+              <w:left w:val="single" w:sz="6" w:space="0" w:color="C4C7C5"/>
+              <w:bottom w:val="single" w:sz="6" w:space="0" w:color="C4C7C5"/>
+              <w:right w:val="single" w:sz="6" w:space="0" w:color="C4C7C5"/>
+            </w:tcBorders>
+            <w:tcMar>
+              <w:top w:w="120" w:type="dxa"/>
+              <w:left w:w="180" w:type="dxa"/>
+              <w:bottom w:w="120" w:type="dxa"/>
+              <w:right w:w="180" w:type="dxa"/>
+            </w:tcMar>
+            <w:vAlign w:val="center"/>
+          </w:tcPr>
+          <w:p>
+            <w:pPr>
+              <w:rPr>
+                <w:rFonts w:ascii="Times New Roman" w:hAnsi="Times New Roman" w:cs="Times New Roman"/>
+                <w:sz w:val="26"/>
+                <w:szCs w:val="26"/>
+              </w:rPr>
+            </w:pPr>
+            <w:r>
+              <w:rPr>
+                <w:rFonts w:ascii="Times New Roman" w:hAnsi="Times New Roman" w:cs="Times New Roman"/>
+                <w:sz w:val="26"/>
+                <w:szCs w:val="26"/>
+              </w:rPr>
+              <w:t>Loc Status</w:t>
+            </w:r>
+          </w:p>
+        </w:tc>
+        <w:tc>
+          <w:tcPr>
+            <w:tcW w:w="0" w:type="auto"/>
+            <w:tcBorders>
+              <w:top w:val="single" w:sz="6" w:space="0" w:color="C4C7C5"/>
+              <w:left w:val="single" w:sz="6" w:space="0" w:color="C4C7C5"/>
+              <w:bottom w:val="single" w:sz="6" w:space="0" w:color="C4C7C5"/>
+              <w:right w:val="single" w:sz="6" w:space="0" w:color="C4C7C5"/>
+            </w:tcBorders>
+            <w:tcMar>
+              <w:top w:w="120" w:type="dxa"/>
+              <w:left w:w="180" w:type="dxa"/>
+              <w:bottom w:w="120" w:type="dxa"/>
+              <w:right w:w="180" w:type="dxa"/>
+            </w:tcMar>
+            <w:vAlign w:val="center"/>
+          </w:tcPr>
+          <w:p>
+            <w:pPr>
+              <w:rPr>
+                <w:rFonts w:ascii="Times New Roman" w:hAnsi="Times New Roman" w:cs="Times New Roman"/>
+                <w:sz w:val="26"/>
+                <w:szCs w:val="26"/>
+              </w:rPr>
+            </w:pPr>
+            <w:r>
+              <w:rPr>
+                <w:rFonts w:ascii="Times New Roman" w:hAnsi="Times New Roman" w:cs="Times New Roman"/>
+                <w:sz w:val="26"/>
+                <w:szCs w:val="26"/>
+              </w:rPr>
+              <w:t>Int</w:t>
+            </w:r>
+          </w:p>
+        </w:tc>
+        <w:tc>
+          <w:tcPr>
+            <w:tcW w:w="0" w:type="auto"/>
+            <w:tcBorders>
+              <w:top w:val="single" w:sz="6" w:space="0" w:color="C4C7C5"/>
+              <w:left w:val="single" w:sz="6" w:space="0" w:color="C4C7C5"/>
+              <w:bottom w:val="single" w:sz="6" w:space="0" w:color="C4C7C5"/>
+              <w:right w:val="single" w:sz="6" w:space="0" w:color="C4C7C5"/>
+            </w:tcBorders>
+            <w:tcMar>
+              <w:top w:w="120" w:type="dxa"/>
+              <w:left w:w="180" w:type="dxa"/>
+              <w:bottom w:w="120" w:type="dxa"/>
+              <w:right w:w="180" w:type="dxa"/>
+            </w:tcMar>
+            <w:vAlign w:val="center"/>
+          </w:tcPr>
+          <w:p>
+            <w:pPr>
+              <w:rPr>
+                <w:rFonts w:ascii="Times New Roman" w:hAnsi="Times New Roman" w:cs="Times New Roman"/>
+                <w:sz w:val="26"/>
+                <w:szCs w:val="26"/>
+              </w:rPr>
+            </w:pPr>
+            <w:r>
+              <w:rPr>
+                <w:rFonts w:ascii="Times New Roman" w:hAnsi="Times New Roman" w:cs="Times New Roman"/>
+                <w:sz w:val="26"/>
+                <w:szCs w:val="26"/>
+              </w:rPr>
+              <w:t>Trạng thái chạy(0: Dừng; 1: Chạy)</w:t>
+            </w:r>
+          </w:p>
+        </w:tc>
+        <w:tc>
+          <w:tcPr>
+            <w:tcW w:w="0" w:type="auto"/>
+            <w:tcBorders>
+              <w:top w:val="single" w:sz="6" w:space="0" w:color="C4C7C5"/>
+              <w:left w:val="single" w:sz="6" w:space="0" w:color="C4C7C5"/>
+              <w:bottom w:val="single" w:sz="6" w:space="0" w:color="C4C7C5"/>
+              <w:right w:val="single" w:sz="6" w:space="0" w:color="C4C7C5"/>
+            </w:tcBorders>
+            <w:tcMar>
+              <w:top w:w="120" w:type="dxa"/>
+              <w:left w:w="180" w:type="dxa"/>
+              <w:bottom w:w="120" w:type="dxa"/>
+              <w:right w:w="180" w:type="dxa"/>
+            </w:tcMar>
+            <w:vAlign w:val="center"/>
+          </w:tcPr>
+          <w:p>
+            <w:pPr>
+              <w:rPr>
+                <w:rFonts w:ascii="Times New Roman" w:hAnsi="Times New Roman" w:cs="Times New Roman"/>
+                <w:sz w:val="26"/>
+                <w:szCs w:val="26"/>
+              </w:rPr>
+            </w:pPr>
+            <w:r>
+              <w:rPr>
+                <w:rFonts w:ascii="Times New Roman" w:hAnsi="Times New Roman" w:cs="Times New Roman"/>
+                <w:sz w:val="26"/>
+                <w:szCs w:val="26"/>
+              </w:rPr>
+              <w:t>1</w:t>
+            </w:r>
+          </w:p>
+        </w:tc>
+      </w:tr>
+      <w:tr>
+        <w:trPr>
+          <w:tblCellSpacing w:w="15" w:type="dxa"/>
+        </w:trPr>
+        <w:tc>
+          <w:tcPr>
+            <w:tcW w:w="0" w:type="auto"/>
+            <w:tcBorders>
+              <w:top w:val="single" w:sz="6" w:space="0" w:color="C4C7C5"/>
+              <w:left w:val="single" w:sz="6" w:space="0" w:color="C4C7C5"/>
+              <w:bottom w:val="single" w:sz="6" w:space="0" w:color="C4C7C5"/>
+              <w:right w:val="single" w:sz="6" w:space="0" w:color="C4C7C5"/>
+            </w:tcBorders>
+            <w:tcMar>
+              <w:top w:w="120" w:type="dxa"/>
+              <w:left w:w="180" w:type="dxa"/>
+              <w:bottom w:w="120" w:type="dxa"/>
+              <w:right w:w="180" w:type="dxa"/>
+            </w:tcMar>
+            <w:vAlign w:val="center"/>
+          </w:tcPr>
+          <w:p>
+            <w:pPr>
+              <w:rPr>
+                <w:rFonts w:ascii="Times New Roman" w:hAnsi="Times New Roman" w:cs="Times New Roman"/>
+                <w:sz w:val="26"/>
+                <w:szCs w:val="26"/>
+              </w:rPr>
+            </w:pPr>
+            <w:r>
+              <w:rPr>
+                <w:rFonts w:ascii="Times New Roman" w:hAnsi="Times New Roman" w:cs="Times New Roman"/>
+                <w:sz w:val="26"/>
+                <w:szCs w:val="26"/>
+              </w:rPr>
+              <w:t>Fan Status</w:t>
+            </w:r>
+          </w:p>
+        </w:tc>
+        <w:tc>
+          <w:tcPr>
+            <w:tcW w:w="0" w:type="auto"/>
+            <w:tcBorders>
+              <w:top w:val="single" w:sz="6" w:space="0" w:color="C4C7C5"/>
+              <w:left w:val="single" w:sz="6" w:space="0" w:color="C4C7C5"/>
+              <w:bottom w:val="single" w:sz="6" w:space="0" w:color="C4C7C5"/>
+              <w:right w:val="single" w:sz="6" w:space="0" w:color="C4C7C5"/>
+            </w:tcBorders>
+            <w:tcMar>
+              <w:top w:w="120" w:type="dxa"/>
+              <w:left w:w="180" w:type="dxa"/>
+              <w:bottom w:w="120" w:type="dxa"/>
+              <w:right w:w="180" w:type="dxa"/>
+            </w:tcMar>
+            <w:vAlign w:val="center"/>
+          </w:tcPr>
+          <w:p>
+            <w:pPr>
+              <w:rPr>
+                <w:rFonts w:ascii="Times New Roman" w:hAnsi="Times New Roman" w:cs="Times New Roman"/>
+                <w:sz w:val="26"/>
+                <w:szCs w:val="26"/>
+              </w:rPr>
+            </w:pPr>
+            <w:r>
+              <w:rPr>
+                <w:rFonts w:ascii="Times New Roman" w:hAnsi="Times New Roman" w:cs="Times New Roman"/>
+                <w:sz w:val="26"/>
+                <w:szCs w:val="26"/>
+              </w:rPr>
+              <w:t>Int</w:t>
+            </w:r>
+          </w:p>
+        </w:tc>
+        <w:tc>
+          <w:tcPr>
+            <w:tcW w:w="0" w:type="auto"/>
+            <w:tcBorders>
+              <w:top w:val="single" w:sz="6" w:space="0" w:color="C4C7C5"/>
+              <w:left w:val="single" w:sz="6" w:space="0" w:color="C4C7C5"/>
+              <w:bottom w:val="single" w:sz="6" w:space="0" w:color="C4C7C5"/>
+              <w:right w:val="single" w:sz="6" w:space="0" w:color="C4C7C5"/>
+            </w:tcBorders>
+            <w:tcMar>
+              <w:top w:w="120" w:type="dxa"/>
+              <w:left w:w="180" w:type="dxa"/>
+              <w:bottom w:w="120" w:type="dxa"/>
+              <w:right w:w="180" w:type="dxa"/>
+            </w:tcMar>
+            <w:vAlign w:val="center"/>
+          </w:tcPr>
+          <w:p>
+            <w:pPr>
+              <w:rPr>
+                <w:rFonts w:ascii="Times New Roman" w:hAnsi="Times New Roman" w:cs="Times New Roman"/>
+                <w:sz w:val="26"/>
+                <w:szCs w:val="26"/>
+              </w:rPr>
+            </w:pPr>
+            <w:r>
+              <w:rPr>
+                <w:rFonts w:ascii="Times New Roman" w:hAnsi="Times New Roman" w:cs="Times New Roman"/>
+                <w:sz w:val="26"/>
+                <w:szCs w:val="26"/>
+              </w:rPr>
+              <w:t>Trạng thái chạy(0: Dừng; 1: Chạy)</w:t>
+            </w:r>
+          </w:p>
+        </w:tc>
+        <w:tc>
+          <w:tcPr>
+            <w:tcW w:w="0" w:type="auto"/>
+            <w:tcBorders>
+              <w:top w:val="single" w:sz="6" w:space="0" w:color="C4C7C5"/>
+              <w:left w:val="single" w:sz="6" w:space="0" w:color="C4C7C5"/>
+              <w:bottom w:val="single" w:sz="6" w:space="0" w:color="C4C7C5"/>
+              <w:right w:val="single" w:sz="6" w:space="0" w:color="C4C7C5"/>
+            </w:tcBorders>
+            <w:tcMar>
+              <w:top w:w="120" w:type="dxa"/>
+              <w:left w:w="180" w:type="dxa"/>
+              <w:bottom w:w="120" w:type="dxa"/>
+              <w:right w:w="180" w:type="dxa"/>
+            </w:tcMar>
+            <w:vAlign w:val="center"/>
+          </w:tcPr>
+          <w:p>
+            <w:pPr>
+              <w:rPr>
+                <w:rFonts w:ascii="Times New Roman" w:hAnsi="Times New Roman" w:cs="Times New Roman"/>
+                <w:sz w:val="26"/>
+                <w:szCs w:val="26"/>
+              </w:rPr>
+            </w:pPr>
+            <w:r>
+              <w:rPr>
+                <w:rFonts w:ascii="Times New Roman" w:hAnsi="Times New Roman" w:cs="Times New Roman"/>
+                <w:sz w:val="26"/>
+                <w:szCs w:val="26"/>
+              </w:rPr>
+              <w:t>1</w:t>
+            </w:r>
+          </w:p>
+        </w:tc>
+      </w:tr>
+      <w:tr>
+        <w:trPr>
+          <w:tblCellSpacing w:w="15" w:type="dxa"/>
+        </w:trPr>
+        <w:tc>
+          <w:tcPr>
+            <w:tcW w:w="0" w:type="auto"/>
+            <w:tcBorders>
+              <w:top w:val="single" w:sz="6" w:space="0" w:color="C4C7C5"/>
+              <w:left w:val="single" w:sz="6" w:space="0" w:color="C4C7C5"/>
+              <w:bottom w:val="single" w:sz="6" w:space="0" w:color="C4C7C5"/>
+              <w:right w:val="single" w:sz="6" w:space="0" w:color="C4C7C5"/>
+            </w:tcBorders>
+            <w:tcMar>
+              <w:top w:w="120" w:type="dxa"/>
+              <w:left w:w="180" w:type="dxa"/>
+              <w:bottom w:w="120" w:type="dxa"/>
+              <w:right w:w="180" w:type="dxa"/>
+            </w:tcMar>
+            <w:vAlign w:val="center"/>
+          </w:tcPr>
+          <w:p>
+            <w:pPr>
+              <w:rPr>
+                <w:rFonts w:ascii="Times New Roman" w:hAnsi="Times New Roman" w:cs="Times New Roman"/>
+                <w:sz w:val="26"/>
+                <w:szCs w:val="26"/>
+              </w:rPr>
+            </w:pPr>
+            <w:r>
+              <w:rPr>
+                <w:rFonts w:ascii="Times New Roman" w:hAnsi="Times New Roman" w:cs="Times New Roman"/>
+                <w:sz w:val="26"/>
+                <w:szCs w:val="26"/>
+              </w:rPr>
+              <w:t>Heater Status</w:t>
+            </w:r>
+          </w:p>
+        </w:tc>
+        <w:tc>
+          <w:tcPr>
+            <w:tcW w:w="0" w:type="auto"/>
+            <w:tcBorders>
+              <w:top w:val="single" w:sz="6" w:space="0" w:color="C4C7C5"/>
+              <w:left w:val="single" w:sz="6" w:space="0" w:color="C4C7C5"/>
+              <w:bottom w:val="single" w:sz="6" w:space="0" w:color="C4C7C5"/>
+              <w:right w:val="single" w:sz="6" w:space="0" w:color="C4C7C5"/>
+            </w:tcBorders>
+            <w:tcMar>
+              <w:top w:w="120" w:type="dxa"/>
+              <w:left w:w="180" w:type="dxa"/>
+              <w:bottom w:w="120" w:type="dxa"/>
+              <w:right w:w="180" w:type="dxa"/>
+            </w:tcMar>
+            <w:vAlign w:val="center"/>
+          </w:tcPr>
+          <w:p>
+            <w:pPr>
+              <w:rPr>
+                <w:rFonts w:ascii="Times New Roman" w:hAnsi="Times New Roman" w:cs="Times New Roman"/>
+                <w:sz w:val="26"/>
+                <w:szCs w:val="26"/>
+              </w:rPr>
+            </w:pPr>
+            <w:r>
+              <w:rPr>
+                <w:rFonts w:ascii="Times New Roman" w:hAnsi="Times New Roman" w:cs="Times New Roman"/>
+                <w:sz w:val="26"/>
+                <w:szCs w:val="26"/>
+              </w:rPr>
+              <w:t>int</w:t>
+            </w:r>
+          </w:p>
+        </w:tc>
+        <w:tc>
+          <w:tcPr>
+            <w:tcW w:w="0" w:type="auto"/>
+            <w:tcBorders>
+              <w:top w:val="single" w:sz="6" w:space="0" w:color="C4C7C5"/>
+              <w:left w:val="single" w:sz="6" w:space="0" w:color="C4C7C5"/>
+              <w:bottom w:val="single" w:sz="6" w:space="0" w:color="C4C7C5"/>
+              <w:right w:val="single" w:sz="6" w:space="0" w:color="C4C7C5"/>
+            </w:tcBorders>
+            <w:tcMar>
+              <w:top w:w="120" w:type="dxa"/>
+              <w:left w:w="180" w:type="dxa"/>
+              <w:bottom w:w="120" w:type="dxa"/>
+              <w:right w:w="180" w:type="dxa"/>
+            </w:tcMar>
+            <w:vAlign w:val="center"/>
+          </w:tcPr>
+          <w:p>
+            <w:pPr>
+              <w:rPr>
+                <w:rFonts w:ascii="Times New Roman" w:hAnsi="Times New Roman" w:cs="Times New Roman"/>
+                <w:sz w:val="26"/>
+                <w:szCs w:val="26"/>
+              </w:rPr>
+            </w:pPr>
+            <w:r>
+              <w:rPr>
+                <w:rFonts w:ascii="Times New Roman" w:hAnsi="Times New Roman" w:cs="Times New Roman"/>
+                <w:sz w:val="26"/>
+                <w:szCs w:val="26"/>
+              </w:rPr>
+              <w:t>Trạng thái chạy(0: Dừng; 1: Chạy)</w:t>
+            </w:r>
+          </w:p>
+        </w:tc>
+        <w:tc>
+          <w:tcPr>
+            <w:tcW w:w="0" w:type="auto"/>
+            <w:tcBorders>
+              <w:top w:val="single" w:sz="6" w:space="0" w:color="C4C7C5"/>
+              <w:left w:val="single" w:sz="6" w:space="0" w:color="C4C7C5"/>
+              <w:bottom w:val="single" w:sz="6" w:space="0" w:color="C4C7C5"/>
+              <w:right w:val="single" w:sz="6" w:space="0" w:color="C4C7C5"/>
+            </w:tcBorders>
+            <w:tcMar>
+              <w:top w:w="120" w:type="dxa"/>
+              <w:left w:w="180" w:type="dxa"/>
+              <w:bottom w:w="120" w:type="dxa"/>
+              <w:right w:w="180" w:type="dxa"/>
+            </w:tcMar>
+            <w:vAlign w:val="center"/>
+          </w:tcPr>
+          <w:p>
+            <w:pPr>
+              <w:rPr>
+                <w:rFonts w:ascii="Times New Roman" w:hAnsi="Times New Roman" w:cs="Times New Roman"/>
+                <w:sz w:val="26"/>
+                <w:szCs w:val="26"/>
+              </w:rPr>
+            </w:pPr>
+            <w:r>
+              <w:rPr>
+                <w:rFonts w:ascii="Times New Roman" w:hAnsi="Times New Roman" w:cs="Times New Roman"/>
+                <w:sz w:val="26"/>
+                <w:szCs w:val="26"/>
+              </w:rPr>
+              <w:t>0</w:t>
+            </w:r>
+          </w:p>
+        </w:tc>
+      </w:tr>
     </w:tbl>
     <w:p>
       <w:pPr>
@@ -1859,15 +2304,25 @@
           <w:rFonts w:ascii="Times New Roman" w:hAnsi="Times New Roman" w:cs="Times New Roman"/>
           <w:sz w:val="26"/>
           <w:szCs w:val="26"/>
-        </w:rPr>
-      </w:pPr>
-      <w:r>
-        <w:rPr>
-          <w:rFonts w:ascii="Times New Roman" w:hAnsi="Times New Roman" w:cs="Times New Roman"/>
-          <w:sz w:val="26"/>
-          <w:szCs w:val="26"/>
-        </w:rPr>
-        <w:t xml:space="preserve">Gửi chuỗi lệnh ASCII xuống máy hút ẩm để điều khiển thiết bị. Kết thúc bằng \r\n. </w:t>
+          <w:lang w:val="pt-BR"/>
+        </w:rPr>
+      </w:pPr>
+      <w:r>
+        <w:rPr>
+          <w:rFonts w:ascii="Times New Roman" w:hAnsi="Times New Roman" w:cs="Times New Roman"/>
+          <w:sz w:val="26"/>
+          <w:szCs w:val="26"/>
+        </w:rPr>
+        <w:t xml:space="preserve">Gửi chuỗi lệnh ASCII xuống máy hút ẩm để điều khiển thiết bị. </w:t>
+      </w:r>
+      <w:r>
+        <w:rPr>
+          <w:rFonts w:ascii="Times New Roman" w:hAnsi="Times New Roman" w:cs="Times New Roman"/>
+          <w:sz w:val="26"/>
+          <w:szCs w:val="26"/>
+          <w:lang w:val="pt-BR"/>
+        </w:rPr>
+        <w:t xml:space="preserve">Kết thúc bằng \r\n. </w:t>
       </w:r>
     </w:p>
     <w:p>
@@ -1879,6 +2334,7 @@
           <w:bCs/>
           <w:sz w:val="26"/>
           <w:szCs w:val="26"/>
+          <w:lang w:val="pt-BR"/>
         </w:rPr>
       </w:pPr>
       <w:r>
@@ -1888,6 +2344,7 @@
           <w:bCs/>
           <w:sz w:val="26"/>
           <w:szCs w:val="26"/>
+          <w:lang w:val="pt-BR"/>
         </w:rPr>
         <w:t>2.1. Cài đặt Ngưỡng Độ Ẩm (SH=)</w:t>
       </w:r>
@@ -1903,13 +2360,15 @@
           <w:rFonts w:ascii="Times New Roman" w:hAnsi="Times New Roman" w:cs="Times New Roman"/>
           <w:sz w:val="26"/>
           <w:szCs w:val="26"/>
-        </w:rPr>
-      </w:pPr>
-      <w:r>
-        <w:rPr>
-          <w:rFonts w:ascii="Times New Roman" w:hAnsi="Times New Roman" w:cs="Times New Roman"/>
-          <w:sz w:val="26"/>
-          <w:szCs w:val="26"/>
+          <w:lang w:val="pt-BR"/>
+        </w:rPr>
+      </w:pPr>
+      <w:r>
+        <w:rPr>
+          <w:rFonts w:ascii="Times New Roman" w:hAnsi="Times New Roman" w:cs="Times New Roman"/>
+          <w:sz w:val="26"/>
+          <w:szCs w:val="26"/>
+          <w:lang w:val="pt-BR"/>
         </w:rPr>
         <w:t xml:space="preserve">Cú pháp: SH=&lt;giá_trị_float&gt;\r\n (Hỗ trợ số thực có 1 chữ số thập phân) </w:t>
       </w:r>
@@ -1969,15 +2428,470 @@
           <w:rFonts w:ascii="Times New Roman" w:hAnsi="Times New Roman" w:cs="Times New Roman"/>
           <w:sz w:val="26"/>
           <w:szCs w:val="26"/>
-        </w:rPr>
-      </w:pPr>
-      <w:r>
-        <w:rPr>
-          <w:rFonts w:ascii="Times New Roman" w:hAnsi="Times New Roman" w:cs="Times New Roman"/>
-          <w:sz w:val="26"/>
-          <w:szCs w:val="26"/>
-        </w:rPr>
+          <w:lang w:val="pt-BR"/>
+        </w:rPr>
+      </w:pPr>
+      <w:r>
+        <w:rPr>
+          <w:rFonts w:ascii="Times New Roman" w:hAnsi="Times New Roman" w:cs="Times New Roman"/>
+          <w:sz w:val="26"/>
+          <w:szCs w:val="26"/>
+          <w:lang w:val="pt-BR"/>
+        </w:rPr>
+        <w:lastRenderedPageBreak/>
         <w:t xml:space="preserve">SH=55.5\r\n </w:t>
+      </w:r>
+      <m:oMath>
+        <m:r>
+          <w:rPr>
+            <w:rFonts w:ascii="Cambria Math" w:hAnsi="Cambria Math" w:cs="Times New Roman"/>
+            <w:sz w:val="26"/>
+            <w:szCs w:val="26"/>
+            <w:lang w:val="pt-BR"/>
+          </w:rPr>
+          <m:t>→</m:t>
+        </m:r>
+      </m:oMath>
+      <w:r>
+        <w:rPr>
+          <w:rFonts w:ascii="Times New Roman" w:hAnsi="Times New Roman" w:cs="Times New Roman"/>
+          <w:sz w:val="26"/>
+          <w:szCs w:val="26"/>
+          <w:lang w:val="pt-BR"/>
+        </w:rPr>
+        <w:t xml:space="preserve"> Cài độ ẩm </w:t>
+      </w:r>
+      <m:oMath>
+        <m:r>
+          <w:rPr>
+            <w:rFonts w:ascii="Cambria Math" w:hAnsi="Cambria Math" w:cs="Times New Roman"/>
+            <w:sz w:val="26"/>
+            <w:szCs w:val="26"/>
+            <w:lang w:val="pt-BR"/>
+          </w:rPr>
+          <m:t>55.5%</m:t>
+        </m:r>
+      </m:oMath>
+    </w:p>
+    <w:p>
+      <w:pPr>
+        <w:numPr>
+          <w:ilvl w:val="1"/>
+          <w:numId w:val="9"/>
+        </w:numPr>
+        <w:jc w:val="both"/>
+        <w:rPr>
+          <w:rFonts w:ascii="Times New Roman" w:hAnsi="Times New Roman" w:cs="Times New Roman"/>
+          <w:sz w:val="26"/>
+          <w:szCs w:val="26"/>
+          <w:lang w:val="pt-BR"/>
+        </w:rPr>
+      </w:pPr>
+      <w:r>
+        <w:rPr>
+          <w:rFonts w:ascii="Times New Roman" w:hAnsi="Times New Roman" w:cs="Times New Roman"/>
+          <w:sz w:val="26"/>
+          <w:szCs w:val="26"/>
+          <w:lang w:val="pt-BR"/>
+        </w:rPr>
+        <w:t xml:space="preserve">SH=60\r\n </w:t>
+      </w:r>
+      <m:oMath>
+        <m:r>
+          <w:rPr>
+            <w:rFonts w:ascii="Cambria Math" w:hAnsi="Cambria Math" w:cs="Times New Roman"/>
+            <w:sz w:val="26"/>
+            <w:szCs w:val="26"/>
+            <w:lang w:val="pt-BR"/>
+          </w:rPr>
+          <m:t>→</m:t>
+        </m:r>
+      </m:oMath>
+      <w:r>
+        <w:rPr>
+          <w:rFonts w:ascii="Times New Roman" w:hAnsi="Times New Roman" w:cs="Times New Roman"/>
+          <w:sz w:val="26"/>
+          <w:szCs w:val="26"/>
+          <w:lang w:val="pt-BR"/>
+        </w:rPr>
+        <w:t xml:space="preserve"> Cài độ ẩm </w:t>
+      </w:r>
+      <m:oMath>
+        <m:r>
+          <w:rPr>
+            <w:rFonts w:ascii="Cambria Math" w:hAnsi="Cambria Math" w:cs="Times New Roman"/>
+            <w:sz w:val="26"/>
+            <w:szCs w:val="26"/>
+            <w:lang w:val="pt-BR"/>
+          </w:rPr>
+          <m:t>60.0%</m:t>
+        </m:r>
+      </m:oMath>
+    </w:p>
+    <w:p>
+      <w:pPr>
+        <w:jc w:val="both"/>
+        <w:rPr>
+          <w:rFonts w:ascii="Times New Roman" w:hAnsi="Times New Roman" w:cs="Times New Roman"/>
+          <w:b/>
+          <w:bCs/>
+          <w:sz w:val="26"/>
+          <w:szCs w:val="26"/>
+          <w:lang w:val="pt-BR"/>
+        </w:rPr>
+      </w:pPr>
+      <w:r>
+        <w:rPr>
+          <w:rFonts w:ascii="Times New Roman" w:hAnsi="Times New Roman" w:cs="Times New Roman"/>
+          <w:b/>
+          <w:bCs/>
+          <w:sz w:val="26"/>
+          <w:szCs w:val="26"/>
+          <w:lang w:val="pt-BR"/>
+        </w:rPr>
+        <w:t>2.2. Cài đặt Ngưỡng Nhiệt Độ (ST=)</w:t>
+      </w:r>
+    </w:p>
+    <w:p>
+      <w:pPr>
+        <w:numPr>
+          <w:ilvl w:val="0"/>
+          <w:numId w:val="10"/>
+        </w:numPr>
+        <w:jc w:val="both"/>
+        <w:rPr>
+          <w:rFonts w:ascii="Times New Roman" w:hAnsi="Times New Roman" w:cs="Times New Roman"/>
+          <w:sz w:val="26"/>
+          <w:szCs w:val="26"/>
+          <w:lang w:val="pt-BR"/>
+        </w:rPr>
+      </w:pPr>
+      <w:r>
+        <w:rPr>
+          <w:rFonts w:ascii="Times New Roman" w:hAnsi="Times New Roman" w:cs="Times New Roman"/>
+          <w:sz w:val="26"/>
+          <w:szCs w:val="26"/>
+          <w:lang w:val="pt-BR"/>
+        </w:rPr>
+        <w:t xml:space="preserve">Cú pháp: ST=&lt;giá_trị_float&gt;\r\n (Hỗ trợ số thực có 1 chữ số thập phân) </w:t>
+      </w:r>
+    </w:p>
+    <w:p>
+      <w:pPr>
+        <w:numPr>
+          <w:ilvl w:val="0"/>
+          <w:numId w:val="10"/>
+        </w:numPr>
+        <w:jc w:val="both"/>
+        <w:rPr>
+          <w:rFonts w:ascii="Times New Roman" w:hAnsi="Times New Roman" w:cs="Times New Roman"/>
+          <w:sz w:val="26"/>
+          <w:szCs w:val="26"/>
+        </w:rPr>
+      </w:pPr>
+      <w:r>
+        <w:rPr>
+          <w:rFonts w:ascii="Times New Roman" w:hAnsi="Times New Roman" w:cs="Times New Roman"/>
+          <w:sz w:val="26"/>
+          <w:szCs w:val="26"/>
+        </w:rPr>
+        <w:t>Khoảng chấp nhận: 0.0 đến 50.0</w:t>
+      </w:r>
+    </w:p>
+    <w:p>
+      <w:pPr>
+        <w:numPr>
+          <w:ilvl w:val="0"/>
+          <w:numId w:val="10"/>
+        </w:numPr>
+        <w:jc w:val="both"/>
+        <w:rPr>
+          <w:rFonts w:ascii="Times New Roman" w:hAnsi="Times New Roman" w:cs="Times New Roman"/>
+          <w:sz w:val="26"/>
+          <w:szCs w:val="26"/>
+        </w:rPr>
+      </w:pPr>
+      <w:r>
+        <w:rPr>
+          <w:rFonts w:ascii="Times New Roman" w:hAnsi="Times New Roman" w:cs="Times New Roman"/>
+          <w:sz w:val="26"/>
+          <w:szCs w:val="26"/>
+        </w:rPr>
+        <w:t>Ví dụ:</w:t>
+      </w:r>
+    </w:p>
+    <w:p>
+      <w:pPr>
+        <w:numPr>
+          <w:ilvl w:val="1"/>
+          <w:numId w:val="10"/>
+        </w:numPr>
+        <w:jc w:val="both"/>
+        <w:rPr>
+          <w:rFonts w:ascii="Times New Roman" w:hAnsi="Times New Roman" w:cs="Times New Roman"/>
+          <w:sz w:val="26"/>
+          <w:szCs w:val="26"/>
+          <w:lang w:val="pt-BR"/>
+        </w:rPr>
+      </w:pPr>
+      <w:r>
+        <w:rPr>
+          <w:rFonts w:ascii="Times New Roman" w:hAnsi="Times New Roman" w:cs="Times New Roman"/>
+          <w:sz w:val="26"/>
+          <w:szCs w:val="26"/>
+          <w:lang w:val="pt-BR"/>
+        </w:rPr>
+        <w:t xml:space="preserve">ST=28.5\r\n </w:t>
+      </w:r>
+      <m:oMath>
+        <m:r>
+          <w:rPr>
+            <w:rFonts w:ascii="Cambria Math" w:hAnsi="Cambria Math" w:cs="Times New Roman"/>
+            <w:sz w:val="26"/>
+            <w:szCs w:val="26"/>
+            <w:lang w:val="pt-BR"/>
+          </w:rPr>
+          <m:t>→</m:t>
+        </m:r>
+      </m:oMath>
+      <w:r>
+        <w:rPr>
+          <w:rFonts w:ascii="Times New Roman" w:hAnsi="Times New Roman" w:cs="Times New Roman"/>
+          <w:sz w:val="26"/>
+          <w:szCs w:val="26"/>
+          <w:lang w:val="pt-BR"/>
+        </w:rPr>
+        <w:t xml:space="preserve"> Cài nhiệt độ </w:t>
+      </w:r>
+      <m:oMath>
+        <m:sSup>
+          <m:sSupPr>
+            <m:ctrlPr>
+              <w:rPr>
+                <w:rFonts w:ascii="Cambria Math" w:hAnsi="Cambria Math" w:cs="Times New Roman"/>
+                <w:sz w:val="26"/>
+                <w:szCs w:val="26"/>
+              </w:rPr>
+            </m:ctrlPr>
+          </m:sSupPr>
+          <m:e>
+            <m:r>
+              <w:rPr>
+                <w:rFonts w:ascii="Cambria Math" w:hAnsi="Cambria Math" w:cs="Times New Roman"/>
+                <w:sz w:val="26"/>
+                <w:szCs w:val="26"/>
+                <w:lang w:val="pt-BR"/>
+              </w:rPr>
+              <m:t>28.5</m:t>
+            </m:r>
+          </m:e>
+          <m:sup>
+            <m:r>
+              <w:rPr>
+                <w:rFonts w:ascii="Cambria Math" w:hAnsi="Cambria Math" w:cs="Times New Roman"/>
+                <w:sz w:val="26"/>
+                <w:szCs w:val="26"/>
+                <w:lang w:val="pt-BR"/>
+              </w:rPr>
+              <m:t>∘</m:t>
+            </m:r>
+          </m:sup>
+        </m:sSup>
+        <m:r>
+          <m:rPr>
+            <m:nor/>
+          </m:rPr>
+          <w:rPr>
+            <w:rFonts w:ascii="Times New Roman" w:hAnsi="Times New Roman" w:cs="Times New Roman"/>
+            <w:sz w:val="26"/>
+            <w:szCs w:val="26"/>
+            <w:lang w:val="pt-BR"/>
+          </w:rPr>
+          <m:t>C</m:t>
+        </m:r>
+      </m:oMath>
+    </w:p>
+    <w:p>
+      <w:pPr>
+        <w:numPr>
+          <w:ilvl w:val="1"/>
+          <w:numId w:val="10"/>
+        </w:numPr>
+        <w:jc w:val="both"/>
+        <w:rPr>
+          <w:rFonts w:ascii="Times New Roman" w:hAnsi="Times New Roman" w:cs="Times New Roman"/>
+          <w:sz w:val="26"/>
+          <w:szCs w:val="26"/>
+          <w:lang w:val="pt-BR"/>
+        </w:rPr>
+      </w:pPr>
+      <w:r>
+        <w:rPr>
+          <w:rFonts w:ascii="Times New Roman" w:hAnsi="Times New Roman" w:cs="Times New Roman"/>
+          <w:sz w:val="26"/>
+          <w:szCs w:val="26"/>
+          <w:lang w:val="pt-BR"/>
+        </w:rPr>
+        <w:t xml:space="preserve">ST=30\r\n </w:t>
+      </w:r>
+      <m:oMath>
+        <m:r>
+          <w:rPr>
+            <w:rFonts w:ascii="Cambria Math" w:hAnsi="Cambria Math" w:cs="Times New Roman"/>
+            <w:sz w:val="26"/>
+            <w:szCs w:val="26"/>
+            <w:lang w:val="pt-BR"/>
+          </w:rPr>
+          <m:t>→</m:t>
+        </m:r>
+      </m:oMath>
+      <w:r>
+        <w:rPr>
+          <w:rFonts w:ascii="Times New Roman" w:hAnsi="Times New Roman" w:cs="Times New Roman"/>
+          <w:sz w:val="26"/>
+          <w:szCs w:val="26"/>
+          <w:lang w:val="pt-BR"/>
+        </w:rPr>
+        <w:t xml:space="preserve"> Cài nhiệt độ </w:t>
+      </w:r>
+      <m:oMath>
+        <m:sSup>
+          <m:sSupPr>
+            <m:ctrlPr>
+              <w:rPr>
+                <w:rFonts w:ascii="Cambria Math" w:hAnsi="Cambria Math" w:cs="Times New Roman"/>
+                <w:sz w:val="26"/>
+                <w:szCs w:val="26"/>
+              </w:rPr>
+            </m:ctrlPr>
+          </m:sSupPr>
+          <m:e>
+            <m:r>
+              <w:rPr>
+                <w:rFonts w:ascii="Cambria Math" w:hAnsi="Cambria Math" w:cs="Times New Roman"/>
+                <w:sz w:val="26"/>
+                <w:szCs w:val="26"/>
+                <w:lang w:val="pt-BR"/>
+              </w:rPr>
+              <m:t>30.0</m:t>
+            </m:r>
+          </m:e>
+          <m:sup>
+            <m:r>
+              <w:rPr>
+                <w:rFonts w:ascii="Cambria Math" w:hAnsi="Cambria Math" w:cs="Times New Roman"/>
+                <w:sz w:val="26"/>
+                <w:szCs w:val="26"/>
+                <w:lang w:val="pt-BR"/>
+              </w:rPr>
+              <m:t>∘</m:t>
+            </m:r>
+          </m:sup>
+        </m:sSup>
+        <m:r>
+          <m:rPr>
+            <m:nor/>
+          </m:rPr>
+          <w:rPr>
+            <w:rFonts w:ascii="Times New Roman" w:hAnsi="Times New Roman" w:cs="Times New Roman"/>
+            <w:sz w:val="26"/>
+            <w:szCs w:val="26"/>
+            <w:lang w:val="pt-BR"/>
+          </w:rPr>
+          <m:t>C</m:t>
+        </m:r>
+      </m:oMath>
+    </w:p>
+    <w:p>
+      <w:pPr>
+        <w:jc w:val="both"/>
+        <w:rPr>
+          <w:rFonts w:ascii="Times New Roman" w:hAnsi="Times New Roman" w:cs="Times New Roman"/>
+          <w:b/>
+          <w:bCs/>
+          <w:sz w:val="26"/>
+          <w:szCs w:val="26"/>
+          <w:lang w:val="pt-BR"/>
+        </w:rPr>
+      </w:pPr>
+      <w:r>
+        <w:rPr>
+          <w:rFonts w:ascii="Times New Roman" w:hAnsi="Times New Roman" w:cs="Times New Roman"/>
+          <w:b/>
+          <w:bCs/>
+          <w:sz w:val="26"/>
+          <w:szCs w:val="26"/>
+          <w:lang w:val="pt-BR"/>
+        </w:rPr>
+        <w:t>2.3. Chuyển Chế Độ Hoạt Động (MD=)</w:t>
+      </w:r>
+    </w:p>
+    <w:p>
+      <w:pPr>
+        <w:numPr>
+          <w:ilvl w:val="0"/>
+          <w:numId w:val="11"/>
+        </w:numPr>
+        <w:jc w:val="both"/>
+        <w:rPr>
+          <w:rFonts w:ascii="Times New Roman" w:hAnsi="Times New Roman" w:cs="Times New Roman"/>
+          <w:sz w:val="26"/>
+          <w:szCs w:val="26"/>
+          <w:lang w:val="pt-BR"/>
+        </w:rPr>
+      </w:pPr>
+      <w:r>
+        <w:rPr>
+          <w:rFonts w:ascii="Times New Roman" w:hAnsi="Times New Roman" w:cs="Times New Roman"/>
+          <w:sz w:val="26"/>
+          <w:szCs w:val="26"/>
+          <w:lang w:val="pt-BR"/>
+        </w:rPr>
+        <w:t>Cú pháp: MD=&lt;mã_chế_độ&gt;\r\n</w:t>
+      </w:r>
+    </w:p>
+    <w:p>
+      <w:pPr>
+        <w:numPr>
+          <w:ilvl w:val="0"/>
+          <w:numId w:val="11"/>
+        </w:numPr>
+        <w:jc w:val="both"/>
+        <w:rPr>
+          <w:rFonts w:ascii="Times New Roman" w:hAnsi="Times New Roman" w:cs="Times New Roman"/>
+          <w:sz w:val="26"/>
+          <w:szCs w:val="26"/>
+        </w:rPr>
+      </w:pPr>
+      <w:r>
+        <w:rPr>
+          <w:rFonts w:ascii="Times New Roman" w:hAnsi="Times New Roman" w:cs="Times New Roman"/>
+          <w:sz w:val="26"/>
+          <w:szCs w:val="26"/>
+        </w:rPr>
+        <w:t>Giá trị:</w:t>
+      </w:r>
+    </w:p>
+    <w:p>
+      <w:pPr>
+        <w:numPr>
+          <w:ilvl w:val="1"/>
+          <w:numId w:val="11"/>
+        </w:numPr>
+        <w:jc w:val="both"/>
+        <w:rPr>
+          <w:rFonts w:ascii="Times New Roman" w:hAnsi="Times New Roman" w:cs="Times New Roman"/>
+          <w:sz w:val="26"/>
+          <w:szCs w:val="26"/>
+        </w:rPr>
+      </w:pPr>
+      <w:r>
+        <w:rPr>
+          <w:rFonts w:ascii="Times New Roman" w:hAnsi="Times New Roman" w:cs="Times New Roman"/>
+          <w:sz w:val="26"/>
+          <w:szCs w:val="26"/>
+        </w:rPr>
+        <w:t xml:space="preserve">MD=0\r\n </w:t>
       </w:r>
       <m:oMath>
         <m:r>
@@ -1995,24 +2909,14 @@
           <w:sz w:val="26"/>
           <w:szCs w:val="26"/>
         </w:rPr>
-        <w:t xml:space="preserve"> Cài độ ẩm </w:t>
-      </w:r>
-      <m:oMath>
-        <m:r>
-          <w:rPr>
-            <w:rFonts w:ascii="Cambria Math" w:hAnsi="Cambria Math" w:cs="Times New Roman"/>
-            <w:sz w:val="26"/>
-            <w:szCs w:val="26"/>
-          </w:rPr>
-          <m:t>55.5%</m:t>
-        </m:r>
-      </m:oMath>
+        <w:t xml:space="preserve"> Chuyển sang Chế độ THÔNG MINH (MODE_THONG_MINH) </w:t>
+      </w:r>
     </w:p>
     <w:p>
       <w:pPr>
         <w:numPr>
           <w:ilvl w:val="1"/>
-          <w:numId w:val="9"/>
+          <w:numId w:val="11"/>
         </w:numPr>
         <w:jc w:val="both"/>
         <w:rPr>
@@ -2027,7 +2931,7 @@
           <w:sz w:val="26"/>
           <w:szCs w:val="26"/>
         </w:rPr>
-        <w:t xml:space="preserve">SH=60\r\n </w:t>
+        <w:t xml:space="preserve">MD=1\r\n </w:t>
       </w:r>
       <m:oMath>
         <m:r>
@@ -2045,7 +2949,155 @@
           <w:sz w:val="26"/>
           <w:szCs w:val="26"/>
         </w:rPr>
-        <w:t xml:space="preserve"> Cài độ ẩm </w:t>
+        <w:t xml:space="preserve"> Chuyển sang Chế độ LIÊN TỤC (MODE_LIEN_TUC) </w:t>
+      </w:r>
+    </w:p>
+    <w:p>
+      <w:pPr>
+        <w:jc w:val="both"/>
+        <w:rPr>
+          <w:rFonts w:ascii="Times New Roman" w:hAnsi="Times New Roman" w:cs="Times New Roman"/>
+          <w:sz w:val="26"/>
+          <w:szCs w:val="26"/>
+        </w:rPr>
+      </w:pPr>
+    </w:p>
+    <w:p>
+      <w:pPr>
+        <w:jc w:val="both"/>
+        <w:rPr>
+          <w:rFonts w:ascii="Times New Roman" w:hAnsi="Times New Roman" w:cs="Times New Roman"/>
+          <w:sz w:val="26"/>
+          <w:szCs w:val="26"/>
+        </w:rPr>
+      </w:pPr>
+      <w:r>
+        <w:rPr>
+          <w:rFonts w:ascii="Times New Roman" w:hAnsi="Times New Roman" w:cs="Times New Roman"/>
+          <w:sz w:val="26"/>
+          <w:szCs w:val="26"/>
+        </w:rPr>
+        <w:t>2.4. Cài đă</w:t>
+      </w:r>
+      <w:r>
+        <w:rPr>
+          <w:rFonts w:ascii="Times New Roman" w:hAnsi="Times New Roman" w:cs="Times New Roman"/>
+          <w:sz w:val="26"/>
+          <w:szCs w:val="26"/>
+        </w:rPr>
+        <w:t>t</w:t>
+      </w:r>
+      <w:r>
+        <w:rPr>
+          <w:rFonts w:ascii="Times New Roman" w:hAnsi="Times New Roman" w:cs="Times New Roman"/>
+          <w:sz w:val="26"/>
+          <w:szCs w:val="26"/>
+        </w:rPr>
+        <w:t xml:space="preserve"> cùng lúc nhiều thông số</w:t>
+      </w:r>
+    </w:p>
+    <w:p>
+      <w:pPr>
+        <w:jc w:val="both"/>
+        <w:rPr>
+          <w:rFonts w:ascii="Times New Roman" w:hAnsi="Times New Roman" w:cs="Times New Roman"/>
+          <w:sz w:val="26"/>
+          <w:szCs w:val="26"/>
+        </w:rPr>
+      </w:pPr>
+      <w:r>
+        <w:rPr>
+          <w:rFonts w:ascii="Times New Roman" w:hAnsi="Times New Roman" w:cs="Times New Roman"/>
+          <w:sz w:val="26"/>
+          <w:szCs w:val="26"/>
+        </w:rPr>
+        <w:t>Cú pháp: ALL=SH=&lt;giá_trị_ẩm&gt;,ST=&lt;giá_trị_nhiệt&gt;,MD=&lt;mã_chế_độ&gt;\r\n</w:t>
+      </w:r>
+    </w:p>
+    <w:p>
+      <w:pPr>
+        <w:jc w:val="both"/>
+        <w:rPr>
+          <w:rFonts w:ascii="Times New Roman" w:hAnsi="Times New Roman" w:cs="Times New Roman"/>
+          <w:sz w:val="26"/>
+          <w:szCs w:val="26"/>
+        </w:rPr>
+      </w:pPr>
+      <w:r>
+        <w:rPr>
+          <w:rFonts w:ascii="Times New Roman" w:hAnsi="Times New Roman" w:cs="Times New Roman"/>
+          <w:sz w:val="26"/>
+          <w:szCs w:val="26"/>
+        </w:rPr>
+        <w:t xml:space="preserve">  </w:t>
+      </w:r>
+      <w:r>
+        <w:rPr>
+          <w:rFonts w:ascii="Times New Roman" w:hAnsi="Times New Roman" w:cs="Times New Roman"/>
+          <w:b/>
+          <w:bCs/>
+          <w:sz w:val="26"/>
+          <w:szCs w:val="26"/>
+        </w:rPr>
+        <w:t>Ví dụ gửi:</w:t>
+      </w:r>
+      <w:r>
+        <w:rPr>
+          <w:rFonts w:ascii="Times New Roman" w:hAnsi="Times New Roman" w:cs="Times New Roman"/>
+          <w:sz w:val="26"/>
+          <w:szCs w:val="26"/>
+        </w:rPr>
+        <w:t xml:space="preserve"> ALL=SH=60.5,ST=28.0,MD=0\r\n</w:t>
+      </w:r>
+    </w:p>
+    <w:p>
+      <w:pPr>
+        <w:jc w:val="both"/>
+        <w:rPr>
+          <w:rFonts w:ascii="Times New Roman" w:hAnsi="Times New Roman" w:cs="Times New Roman"/>
+          <w:sz w:val="26"/>
+          <w:szCs w:val="26"/>
+        </w:rPr>
+      </w:pPr>
+      <w:r>
+        <w:rPr>
+          <w:rFonts w:ascii="Times New Roman" w:hAnsi="Times New Roman" w:cs="Times New Roman"/>
+          <w:sz w:val="26"/>
+          <w:szCs w:val="26"/>
+        </w:rPr>
+        <w:t xml:space="preserve">  </w:t>
+      </w:r>
+      <w:r>
+        <w:rPr>
+          <w:rFonts w:ascii="Times New Roman" w:hAnsi="Times New Roman" w:cs="Times New Roman"/>
+          <w:b/>
+          <w:bCs/>
+          <w:sz w:val="26"/>
+          <w:szCs w:val="26"/>
+        </w:rPr>
+        <w:t>Giải thích:</w:t>
+      </w:r>
+    </w:p>
+    <w:p>
+      <w:pPr>
+        <w:numPr>
+          <w:ilvl w:val="0"/>
+          <w:numId w:val="13"/>
+        </w:numPr>
+        <w:jc w:val="both"/>
+        <w:rPr>
+          <w:rFonts w:ascii="Times New Roman" w:hAnsi="Times New Roman" w:cs="Times New Roman"/>
+          <w:sz w:val="26"/>
+          <w:szCs w:val="26"/>
+        </w:rPr>
+      </w:pPr>
+      <w:r>
+        <w:rPr>
+          <w:rFonts w:ascii="Times New Roman" w:hAnsi="Times New Roman" w:cs="Times New Roman"/>
+          <w:sz w:val="26"/>
+          <w:szCs w:val="26"/>
+        </w:rPr>
+        <w:t xml:space="preserve">Cài độ ẩm: </w:t>
       </w:r>
       <m:oMath>
         <m:r>
@@ -2054,37 +3106,15 @@
             <w:sz w:val="26"/>
             <w:szCs w:val="26"/>
           </w:rPr>
-          <m:t>60.0%</m:t>
+          <m:t>60.5%</m:t>
         </m:r>
       </m:oMath>
     </w:p>
     <w:p>
       <w:pPr>
-        <w:jc w:val="both"/>
-        <w:rPr>
-          <w:rFonts w:ascii="Times New Roman" w:hAnsi="Times New Roman" w:cs="Times New Roman"/>
-          <w:b/>
-          <w:bCs/>
-          <w:sz w:val="26"/>
-          <w:szCs w:val="26"/>
-        </w:rPr>
-      </w:pPr>
-      <w:r>
-        <w:rPr>
-          <w:rFonts w:ascii="Times New Roman" w:hAnsi="Times New Roman" w:cs="Times New Roman"/>
-          <w:b/>
-          <w:bCs/>
-          <w:sz w:val="26"/>
-          <w:szCs w:val="26"/>
-        </w:rPr>
-        <w:t>2.2. Cài đặt Ngưỡng Nhiệt Độ (ST=)</w:t>
-      </w:r>
-    </w:p>
-    <w:p>
-      <w:pPr>
         <w:numPr>
           <w:ilvl w:val="0"/>
-          <w:numId w:val="10"/>
+          <w:numId w:val="13"/>
         </w:numPr>
         <w:jc w:val="both"/>
         <w:rPr>
@@ -2099,92 +3129,7 @@
           <w:sz w:val="26"/>
           <w:szCs w:val="26"/>
         </w:rPr>
-        <w:t xml:space="preserve">Cú pháp: ST=&lt;giá_trị_float&gt;\r\n (Hỗ trợ số thực có 1 chữ số thập phân) </w:t>
-      </w:r>
-    </w:p>
-    <w:p>
-      <w:pPr>
-        <w:numPr>
-          <w:ilvl w:val="0"/>
-          <w:numId w:val="10"/>
-        </w:numPr>
-        <w:jc w:val="both"/>
-        <w:rPr>
-          <w:rFonts w:ascii="Times New Roman" w:hAnsi="Times New Roman" w:cs="Times New Roman"/>
-          <w:sz w:val="26"/>
-          <w:szCs w:val="26"/>
-        </w:rPr>
-      </w:pPr>
-      <w:r>
-        <w:rPr>
-          <w:rFonts w:ascii="Times New Roman" w:hAnsi="Times New Roman" w:cs="Times New Roman"/>
-          <w:sz w:val="26"/>
-          <w:szCs w:val="26"/>
-        </w:rPr>
-        <w:t>Khoảng chấp nhận: 0.0 đến 50.0</w:t>
-      </w:r>
-    </w:p>
-    <w:p>
-      <w:pPr>
-        <w:numPr>
-          <w:ilvl w:val="0"/>
-          <w:numId w:val="10"/>
-        </w:numPr>
-        <w:jc w:val="both"/>
-        <w:rPr>
-          <w:rFonts w:ascii="Times New Roman" w:hAnsi="Times New Roman" w:cs="Times New Roman"/>
-          <w:sz w:val="26"/>
-          <w:szCs w:val="26"/>
-        </w:rPr>
-      </w:pPr>
-      <w:r>
-        <w:rPr>
-          <w:rFonts w:ascii="Times New Roman" w:hAnsi="Times New Roman" w:cs="Times New Roman"/>
-          <w:sz w:val="26"/>
-          <w:szCs w:val="26"/>
-        </w:rPr>
-        <w:t>Ví dụ:</w:t>
-      </w:r>
-    </w:p>
-    <w:p>
-      <w:pPr>
-        <w:numPr>
-          <w:ilvl w:val="1"/>
-          <w:numId w:val="10"/>
-        </w:numPr>
-        <w:jc w:val="both"/>
-        <w:rPr>
-          <w:rFonts w:ascii="Times New Roman" w:hAnsi="Times New Roman" w:cs="Times New Roman"/>
-          <w:sz w:val="26"/>
-          <w:szCs w:val="26"/>
-        </w:rPr>
-      </w:pPr>
-      <w:r>
-        <w:rPr>
-          <w:rFonts w:ascii="Times New Roman" w:hAnsi="Times New Roman" w:cs="Times New Roman"/>
-          <w:sz w:val="26"/>
-          <w:szCs w:val="26"/>
-        </w:rPr>
-        <w:lastRenderedPageBreak/>
-        <w:t xml:space="preserve">ST=28.5\r\n </w:t>
-      </w:r>
-      <m:oMath>
-        <m:r>
-          <w:rPr>
-            <w:rFonts w:ascii="Cambria Math" w:hAnsi="Cambria Math" w:cs="Times New Roman"/>
-            <w:sz w:val="26"/>
-            <w:szCs w:val="26"/>
-          </w:rPr>
-          <m:t>→</m:t>
-        </m:r>
-      </m:oMath>
-      <w:r>
-        <w:rPr>
-          <w:rFonts w:ascii="Times New Roman" w:hAnsi="Times New Roman" w:cs="Times New Roman"/>
-          <w:sz w:val="26"/>
-          <w:szCs w:val="26"/>
-        </w:rPr>
-        <w:t xml:space="preserve"> Cài nhiệt độ </w:t>
+        <w:t xml:space="preserve">Cài nhiệt độ: </w:t>
       </w:r>
       <m:oMath>
         <m:sSup>
@@ -2204,7 +3149,7 @@
                 <w:sz w:val="26"/>
                 <w:szCs w:val="26"/>
               </w:rPr>
-              <m:t>28.5</m:t>
+              <m:t>28.0</m:t>
             </m:r>
           </m:e>
           <m:sup>
@@ -2234,460 +3179,6 @@
     <w:p>
       <w:pPr>
         <w:numPr>
-          <w:ilvl w:val="1"/>
-          <w:numId w:val="10"/>
-        </w:numPr>
-        <w:jc w:val="both"/>
-        <w:rPr>
-          <w:rFonts w:ascii="Times New Roman" w:hAnsi="Times New Roman" w:cs="Times New Roman"/>
-          <w:sz w:val="26"/>
-          <w:szCs w:val="26"/>
-        </w:rPr>
-      </w:pPr>
-      <w:r>
-        <w:rPr>
-          <w:rFonts w:ascii="Times New Roman" w:hAnsi="Times New Roman" w:cs="Times New Roman"/>
-          <w:sz w:val="26"/>
-          <w:szCs w:val="26"/>
-        </w:rPr>
-        <w:t xml:space="preserve">ST=30\r\n </w:t>
-      </w:r>
-      <m:oMath>
-        <m:r>
-          <w:rPr>
-            <w:rFonts w:ascii="Cambria Math" w:hAnsi="Cambria Math" w:cs="Times New Roman"/>
-            <w:sz w:val="26"/>
-            <w:szCs w:val="26"/>
-          </w:rPr>
-          <m:t>→</m:t>
-        </m:r>
-      </m:oMath>
-      <w:r>
-        <w:rPr>
-          <w:rFonts w:ascii="Times New Roman" w:hAnsi="Times New Roman" w:cs="Times New Roman"/>
-          <w:sz w:val="26"/>
-          <w:szCs w:val="26"/>
-        </w:rPr>
-        <w:t xml:space="preserve"> Cài nhiệt độ </w:t>
-      </w:r>
-      <m:oMath>
-        <m:sSup>
-          <m:sSupPr>
-            <m:ctrlPr>
-              <w:rPr>
-                <w:rFonts w:ascii="Cambria Math" w:hAnsi="Cambria Math" w:cs="Times New Roman"/>
-                <w:sz w:val="26"/>
-                <w:szCs w:val="26"/>
-              </w:rPr>
-            </m:ctrlPr>
-          </m:sSupPr>
-          <m:e>
-            <m:r>
-              <w:rPr>
-                <w:rFonts w:ascii="Cambria Math" w:hAnsi="Cambria Math" w:cs="Times New Roman"/>
-                <w:sz w:val="26"/>
-                <w:szCs w:val="26"/>
-              </w:rPr>
-              <m:t>30.0</m:t>
-            </m:r>
-          </m:e>
-          <m:sup>
-            <m:r>
-              <w:rPr>
-                <w:rFonts w:ascii="Cambria Math" w:hAnsi="Cambria Math" w:cs="Times New Roman"/>
-                <w:sz w:val="26"/>
-                <w:szCs w:val="26"/>
-              </w:rPr>
-              <m:t>∘</m:t>
-            </m:r>
-          </m:sup>
-        </m:sSup>
-        <m:r>
-          <m:rPr>
-            <m:nor/>
-          </m:rPr>
-          <w:rPr>
-            <w:rFonts w:ascii="Times New Roman" w:hAnsi="Times New Roman" w:cs="Times New Roman"/>
-            <w:sz w:val="26"/>
-            <w:szCs w:val="26"/>
-          </w:rPr>
-          <m:t>C</m:t>
-        </m:r>
-      </m:oMath>
-    </w:p>
-    <w:p>
-      <w:pPr>
-        <w:jc w:val="both"/>
-        <w:rPr>
-          <w:rFonts w:ascii="Times New Roman" w:hAnsi="Times New Roman" w:cs="Times New Roman"/>
-          <w:b/>
-          <w:bCs/>
-          <w:sz w:val="26"/>
-          <w:szCs w:val="26"/>
-        </w:rPr>
-      </w:pPr>
-      <w:r>
-        <w:rPr>
-          <w:rFonts w:ascii="Times New Roman" w:hAnsi="Times New Roman" w:cs="Times New Roman"/>
-          <w:b/>
-          <w:bCs/>
-          <w:sz w:val="26"/>
-          <w:szCs w:val="26"/>
-        </w:rPr>
-        <w:t>2.3. Chuyển Chế Độ Hoạt Động (MD=)</w:t>
-      </w:r>
-    </w:p>
-    <w:p>
-      <w:pPr>
-        <w:numPr>
-          <w:ilvl w:val="0"/>
-          <w:numId w:val="11"/>
-        </w:numPr>
-        <w:jc w:val="both"/>
-        <w:rPr>
-          <w:rFonts w:ascii="Times New Roman" w:hAnsi="Times New Roman" w:cs="Times New Roman"/>
-          <w:sz w:val="26"/>
-          <w:szCs w:val="26"/>
-        </w:rPr>
-      </w:pPr>
-      <w:r>
-        <w:rPr>
-          <w:rFonts w:ascii="Times New Roman" w:hAnsi="Times New Roman" w:cs="Times New Roman"/>
-          <w:sz w:val="26"/>
-          <w:szCs w:val="26"/>
-        </w:rPr>
-        <w:t>Cú pháp: MD=&lt;mã_chế_độ&gt;\r\n</w:t>
-      </w:r>
-    </w:p>
-    <w:p>
-      <w:pPr>
-        <w:numPr>
-          <w:ilvl w:val="0"/>
-          <w:numId w:val="11"/>
-        </w:numPr>
-        <w:jc w:val="both"/>
-        <w:rPr>
-          <w:rFonts w:ascii="Times New Roman" w:hAnsi="Times New Roman" w:cs="Times New Roman"/>
-          <w:sz w:val="26"/>
-          <w:szCs w:val="26"/>
-        </w:rPr>
-      </w:pPr>
-      <w:r>
-        <w:rPr>
-          <w:rFonts w:ascii="Times New Roman" w:hAnsi="Times New Roman" w:cs="Times New Roman"/>
-          <w:sz w:val="26"/>
-          <w:szCs w:val="26"/>
-        </w:rPr>
-        <w:t>Giá trị:</w:t>
-      </w:r>
-    </w:p>
-    <w:p>
-      <w:pPr>
-        <w:numPr>
-          <w:ilvl w:val="1"/>
-          <w:numId w:val="11"/>
-        </w:numPr>
-        <w:jc w:val="both"/>
-        <w:rPr>
-          <w:rFonts w:ascii="Times New Roman" w:hAnsi="Times New Roman" w:cs="Times New Roman"/>
-          <w:sz w:val="26"/>
-          <w:szCs w:val="26"/>
-        </w:rPr>
-      </w:pPr>
-      <w:r>
-        <w:rPr>
-          <w:rFonts w:ascii="Times New Roman" w:hAnsi="Times New Roman" w:cs="Times New Roman"/>
-          <w:sz w:val="26"/>
-          <w:szCs w:val="26"/>
-        </w:rPr>
-        <w:t xml:space="preserve">MD=0\r\n </w:t>
-      </w:r>
-      <m:oMath>
-        <m:r>
-          <w:rPr>
-            <w:rFonts w:ascii="Cambria Math" w:hAnsi="Cambria Math" w:cs="Times New Roman"/>
-            <w:sz w:val="26"/>
-            <w:szCs w:val="26"/>
-          </w:rPr>
-          <m:t>→</m:t>
-        </m:r>
-      </m:oMath>
-      <w:r>
-        <w:rPr>
-          <w:rFonts w:ascii="Times New Roman" w:hAnsi="Times New Roman" w:cs="Times New Roman"/>
-          <w:sz w:val="26"/>
-          <w:szCs w:val="26"/>
-        </w:rPr>
-        <w:t xml:space="preserve"> Chuyển sang Chế độ THÔNG MINH (MODE_THONG_MINH) </w:t>
-      </w:r>
-    </w:p>
-    <w:p>
-      <w:pPr>
-        <w:numPr>
-          <w:ilvl w:val="1"/>
-          <w:numId w:val="11"/>
-        </w:numPr>
-        <w:jc w:val="both"/>
-        <w:rPr>
-          <w:rFonts w:ascii="Times New Roman" w:hAnsi="Times New Roman" w:cs="Times New Roman"/>
-          <w:sz w:val="26"/>
-          <w:szCs w:val="26"/>
-        </w:rPr>
-      </w:pPr>
-      <w:r>
-        <w:rPr>
-          <w:rFonts w:ascii="Times New Roman" w:hAnsi="Times New Roman" w:cs="Times New Roman"/>
-          <w:sz w:val="26"/>
-          <w:szCs w:val="26"/>
-        </w:rPr>
-        <w:t xml:space="preserve">MD=1\r\n </w:t>
-      </w:r>
-      <m:oMath>
-        <m:r>
-          <w:rPr>
-            <w:rFonts w:ascii="Cambria Math" w:hAnsi="Cambria Math" w:cs="Times New Roman"/>
-            <w:sz w:val="26"/>
-            <w:szCs w:val="26"/>
-          </w:rPr>
-          <m:t>→</m:t>
-        </m:r>
-      </m:oMath>
-      <w:r>
-        <w:rPr>
-          <w:rFonts w:ascii="Times New Roman" w:hAnsi="Times New Roman" w:cs="Times New Roman"/>
-          <w:sz w:val="26"/>
-          <w:szCs w:val="26"/>
-        </w:rPr>
-        <w:t xml:space="preserve"> Chuyển sang Chế độ LIÊN TỤC (MODE_LIEN_TUC) </w:t>
-      </w:r>
-    </w:p>
-    <w:p>
-      <w:pPr>
-        <w:jc w:val="both"/>
-        <w:rPr>
-          <w:rFonts w:ascii="Times New Roman" w:hAnsi="Times New Roman" w:cs="Times New Roman"/>
-          <w:sz w:val="26"/>
-          <w:szCs w:val="26"/>
-        </w:rPr>
-      </w:pPr>
-    </w:p>
-    <w:p>
-      <w:pPr>
-        <w:jc w:val="both"/>
-        <w:rPr>
-          <w:rFonts w:ascii="Times New Roman" w:hAnsi="Times New Roman" w:cs="Times New Roman"/>
-          <w:sz w:val="26"/>
-          <w:szCs w:val="26"/>
-        </w:rPr>
-      </w:pPr>
-      <w:r>
-        <w:rPr>
-          <w:rFonts w:ascii="Times New Roman" w:hAnsi="Times New Roman" w:cs="Times New Roman"/>
-          <w:sz w:val="26"/>
-          <w:szCs w:val="26"/>
-        </w:rPr>
-        <w:t>2.4. Cài đă</w:t>
-      </w:r>
-      <w:r>
-        <w:rPr>
-          <w:rFonts w:ascii="Times New Roman" w:hAnsi="Times New Roman" w:cs="Times New Roman"/>
-          <w:sz w:val="26"/>
-          <w:szCs w:val="26"/>
-        </w:rPr>
-        <w:t>t</w:t>
-      </w:r>
-      <w:r>
-        <w:rPr>
-          <w:rFonts w:ascii="Times New Roman" w:hAnsi="Times New Roman" w:cs="Times New Roman"/>
-          <w:sz w:val="26"/>
-          <w:szCs w:val="26"/>
-        </w:rPr>
-        <w:t xml:space="preserve"> cùng lúc nhiều thông số</w:t>
-      </w:r>
-    </w:p>
-    <w:p>
-      <w:pPr>
-        <w:jc w:val="both"/>
-        <w:rPr>
-          <w:rFonts w:ascii="Times New Roman" w:hAnsi="Times New Roman" w:cs="Times New Roman"/>
-          <w:sz w:val="26"/>
-          <w:szCs w:val="26"/>
-        </w:rPr>
-      </w:pPr>
-      <w:r>
-        <w:rPr>
-          <w:rFonts w:ascii="Times New Roman" w:hAnsi="Times New Roman" w:cs="Times New Roman"/>
-          <w:sz w:val="26"/>
-          <w:szCs w:val="26"/>
-        </w:rPr>
-        <w:t>Cú pháp: ALL=SH=&lt;giá_trị_ẩm&gt;,ST=&lt;giá_trị_nhiệt&gt;,MD=&lt;mã_chế_độ&gt;\r\n</w:t>
-      </w:r>
-    </w:p>
-    <w:p>
-      <w:pPr>
-        <w:jc w:val="both"/>
-        <w:rPr>
-          <w:rFonts w:ascii="Times New Roman" w:hAnsi="Times New Roman" w:cs="Times New Roman"/>
-          <w:sz w:val="26"/>
-          <w:szCs w:val="26"/>
-        </w:rPr>
-      </w:pPr>
-      <w:r>
-        <w:rPr>
-          <w:rFonts w:ascii="Times New Roman" w:hAnsi="Times New Roman" w:cs="Times New Roman"/>
-          <w:sz w:val="26"/>
-          <w:szCs w:val="26"/>
-        </w:rPr>
-        <w:t xml:space="preserve">  </w:t>
-      </w:r>
-      <w:r>
-        <w:rPr>
-          <w:rFonts w:ascii="Times New Roman" w:hAnsi="Times New Roman" w:cs="Times New Roman"/>
-          <w:b/>
-          <w:bCs/>
-          <w:sz w:val="26"/>
-          <w:szCs w:val="26"/>
-        </w:rPr>
-        <w:t>Ví dụ gửi:</w:t>
-      </w:r>
-      <w:r>
-        <w:rPr>
-          <w:rFonts w:ascii="Times New Roman" w:hAnsi="Times New Roman" w:cs="Times New Roman"/>
-          <w:sz w:val="26"/>
-          <w:szCs w:val="26"/>
-        </w:rPr>
-        <w:t xml:space="preserve"> ALL=SH=60.5,ST=28.0,MD=0\r\n</w:t>
-      </w:r>
-    </w:p>
-    <w:p>
-      <w:pPr>
-        <w:jc w:val="both"/>
-        <w:rPr>
-          <w:rFonts w:ascii="Times New Roman" w:hAnsi="Times New Roman" w:cs="Times New Roman"/>
-          <w:sz w:val="26"/>
-          <w:szCs w:val="26"/>
-        </w:rPr>
-      </w:pPr>
-      <w:r>
-        <w:rPr>
-          <w:rFonts w:ascii="Times New Roman" w:hAnsi="Times New Roman" w:cs="Times New Roman"/>
-          <w:sz w:val="26"/>
-          <w:szCs w:val="26"/>
-        </w:rPr>
-        <w:t xml:space="preserve">  </w:t>
-      </w:r>
-      <w:r>
-        <w:rPr>
-          <w:rFonts w:ascii="Times New Roman" w:hAnsi="Times New Roman" w:cs="Times New Roman"/>
-          <w:b/>
-          <w:bCs/>
-          <w:sz w:val="26"/>
-          <w:szCs w:val="26"/>
-        </w:rPr>
-        <w:t>Giải thích:</w:t>
-      </w:r>
-    </w:p>
-    <w:p>
-      <w:pPr>
-        <w:numPr>
-          <w:ilvl w:val="0"/>
-          <w:numId w:val="13"/>
-        </w:numPr>
-        <w:jc w:val="both"/>
-        <w:rPr>
-          <w:rFonts w:ascii="Times New Roman" w:hAnsi="Times New Roman" w:cs="Times New Roman"/>
-          <w:sz w:val="26"/>
-          <w:szCs w:val="26"/>
-        </w:rPr>
-      </w:pPr>
-      <w:r>
-        <w:rPr>
-          <w:rFonts w:ascii="Times New Roman" w:hAnsi="Times New Roman" w:cs="Times New Roman"/>
-          <w:sz w:val="26"/>
-          <w:szCs w:val="26"/>
-        </w:rPr>
-        <w:t xml:space="preserve">Cài độ ẩm: </w:t>
-      </w:r>
-      <m:oMath>
-        <m:r>
-          <w:rPr>
-            <w:rFonts w:ascii="Cambria Math" w:hAnsi="Cambria Math" w:cs="Times New Roman"/>
-            <w:sz w:val="26"/>
-            <w:szCs w:val="26"/>
-          </w:rPr>
-          <m:t>60.5%</m:t>
-        </m:r>
-      </m:oMath>
-    </w:p>
-    <w:p>
-      <w:pPr>
-        <w:numPr>
-          <w:ilvl w:val="0"/>
-          <w:numId w:val="13"/>
-        </w:numPr>
-        <w:jc w:val="both"/>
-        <w:rPr>
-          <w:rFonts w:ascii="Times New Roman" w:hAnsi="Times New Roman" w:cs="Times New Roman"/>
-          <w:sz w:val="26"/>
-          <w:szCs w:val="26"/>
-        </w:rPr>
-      </w:pPr>
-      <w:r>
-        <w:rPr>
-          <w:rFonts w:ascii="Times New Roman" w:hAnsi="Times New Roman" w:cs="Times New Roman"/>
-          <w:sz w:val="26"/>
-          <w:szCs w:val="26"/>
-        </w:rPr>
-        <w:t xml:space="preserve">Cài nhiệt độ: </w:t>
-      </w:r>
-      <m:oMath>
-        <m:sSup>
-          <m:sSupPr>
-            <m:ctrlPr>
-              <w:rPr>
-                <w:rFonts w:ascii="Cambria Math" w:hAnsi="Cambria Math" w:cs="Times New Roman"/>
-                <w:sz w:val="26"/>
-                <w:szCs w:val="26"/>
-              </w:rPr>
-            </m:ctrlPr>
-          </m:sSupPr>
-          <m:e>
-            <m:r>
-              <w:rPr>
-                <w:rFonts w:ascii="Cambria Math" w:hAnsi="Cambria Math" w:cs="Times New Roman"/>
-                <w:sz w:val="26"/>
-                <w:szCs w:val="26"/>
-              </w:rPr>
-              <m:t>28.0</m:t>
-            </m:r>
-          </m:e>
-          <m:sup>
-            <m:r>
-              <w:rPr>
-                <w:rFonts w:ascii="Cambria Math" w:hAnsi="Cambria Math" w:cs="Times New Roman"/>
-                <w:sz w:val="26"/>
-                <w:szCs w:val="26"/>
-              </w:rPr>
-              <m:t>∘</m:t>
-            </m:r>
-          </m:sup>
-        </m:sSup>
-        <m:r>
-          <m:rPr>
-            <m:nor/>
-          </m:rPr>
-          <w:rPr>
-            <w:rFonts w:ascii="Times New Roman" w:hAnsi="Times New Roman" w:cs="Times New Roman"/>
-            <w:sz w:val="26"/>
-            <w:szCs w:val="26"/>
-          </w:rPr>
-          <m:t>C</m:t>
-        </m:r>
-      </m:oMath>
-    </w:p>
-    <w:p>
-      <w:pPr>
-        <w:numPr>
           <w:ilvl w:val="0"/>
           <w:numId w:val="13"/>
         </w:numPr>
@@ -2804,14 +3295,17 @@
           <w:rFonts w:ascii="Times New Roman" w:hAnsi="Times New Roman" w:cs="Times New Roman"/>
           <w:sz w:val="26"/>
           <w:szCs w:val="26"/>
-        </w:rPr>
-      </w:pPr>
-      <w:r>
-        <w:rPr>
-          <w:rFonts w:ascii="Times New Roman" w:hAnsi="Times New Roman" w:cs="Times New Roman"/>
-          <w:sz w:val="26"/>
-          <w:szCs w:val="26"/>
-        </w:rPr>
+          <w:lang w:val="pt-BR"/>
+        </w:rPr>
+      </w:pPr>
+      <w:r>
+        <w:rPr>
+          <w:rFonts w:ascii="Times New Roman" w:hAnsi="Times New Roman" w:cs="Times New Roman"/>
+          <w:sz w:val="26"/>
+          <w:szCs w:val="26"/>
+          <w:lang w:val="pt-BR"/>
+        </w:rPr>
+        <w:lastRenderedPageBreak/>
         <w:t>Cài đặt độ ẩm thành công: Da Nhan SH=55.5\r\n</w:t>
       </w:r>
     </w:p>
@@ -2826,13 +3320,15 @@
           <w:rFonts w:ascii="Times New Roman" w:hAnsi="Times New Roman" w:cs="Times New Roman"/>
           <w:sz w:val="26"/>
           <w:szCs w:val="26"/>
-        </w:rPr>
-      </w:pPr>
-      <w:r>
-        <w:rPr>
-          <w:rFonts w:ascii="Times New Roman" w:hAnsi="Times New Roman" w:cs="Times New Roman"/>
-          <w:sz w:val="26"/>
-          <w:szCs w:val="26"/>
+          <w:lang w:val="pt-BR"/>
+        </w:rPr>
+      </w:pPr>
+      <w:r>
+        <w:rPr>
+          <w:rFonts w:ascii="Times New Roman" w:hAnsi="Times New Roman" w:cs="Times New Roman"/>
+          <w:sz w:val="26"/>
+          <w:szCs w:val="26"/>
+          <w:lang w:val="pt-BR"/>
         </w:rPr>
         <w:t>Lỗi cài độ ẩm (vượt 0.0 - 100.0): Loi Gia Tri SH (0.0 - 100.0)\r\n</w:t>
       </w:r>
@@ -2848,13 +3344,15 @@
           <w:rFonts w:ascii="Times New Roman" w:hAnsi="Times New Roman" w:cs="Times New Roman"/>
           <w:sz w:val="26"/>
           <w:szCs w:val="26"/>
-        </w:rPr>
-      </w:pPr>
-      <w:r>
-        <w:rPr>
-          <w:rFonts w:ascii="Times New Roman" w:hAnsi="Times New Roman" w:cs="Times New Roman"/>
-          <w:sz w:val="26"/>
-          <w:szCs w:val="26"/>
+          <w:lang w:val="pt-BR"/>
+        </w:rPr>
+      </w:pPr>
+      <w:r>
+        <w:rPr>
+          <w:rFonts w:ascii="Times New Roman" w:hAnsi="Times New Roman" w:cs="Times New Roman"/>
+          <w:sz w:val="26"/>
+          <w:szCs w:val="26"/>
+          <w:lang w:val="pt-BR"/>
         </w:rPr>
         <w:t>Cài đặt nhiệt độ thành công: Da Nhan ST=28.5\r\n</w:t>
       </w:r>
@@ -2870,13 +3368,15 @@
           <w:rFonts w:ascii="Times New Roman" w:hAnsi="Times New Roman" w:cs="Times New Roman"/>
           <w:sz w:val="26"/>
           <w:szCs w:val="26"/>
-        </w:rPr>
-      </w:pPr>
-      <w:r>
-        <w:rPr>
-          <w:rFonts w:ascii="Times New Roman" w:hAnsi="Times New Roman" w:cs="Times New Roman"/>
-          <w:sz w:val="26"/>
-          <w:szCs w:val="26"/>
+          <w:lang w:val="pt-BR"/>
+        </w:rPr>
+      </w:pPr>
+      <w:r>
+        <w:rPr>
+          <w:rFonts w:ascii="Times New Roman" w:hAnsi="Times New Roman" w:cs="Times New Roman"/>
+          <w:sz w:val="26"/>
+          <w:szCs w:val="26"/>
+          <w:lang w:val="pt-BR"/>
         </w:rPr>
         <w:t>Lỗi cài nhiệt độ (vượt 0.0 - 50.0): Loi Gia Tri ST (0.0 - 50.0)\r\n</w:t>
       </w:r>
@@ -2892,13 +3392,15 @@
           <w:rFonts w:ascii="Times New Roman" w:hAnsi="Times New Roman" w:cs="Times New Roman"/>
           <w:sz w:val="26"/>
           <w:szCs w:val="26"/>
-        </w:rPr>
-      </w:pPr>
-      <w:r>
-        <w:rPr>
-          <w:rFonts w:ascii="Times New Roman" w:hAnsi="Times New Roman" w:cs="Times New Roman"/>
-          <w:sz w:val="26"/>
-          <w:szCs w:val="26"/>
+          <w:lang w:val="pt-BR"/>
+        </w:rPr>
+      </w:pPr>
+      <w:r>
+        <w:rPr>
+          <w:rFonts w:ascii="Times New Roman" w:hAnsi="Times New Roman" w:cs="Times New Roman"/>
+          <w:sz w:val="26"/>
+          <w:szCs w:val="26"/>
+          <w:lang w:val="pt-BR"/>
         </w:rPr>
         <w:t>Đổi chế độ Thông minh: Da Nhan MD=0 (SMART)\r\n</w:t>
       </w:r>
@@ -2916,38 +3418,47 @@
           <w:bCs/>
           <w:sz w:val="26"/>
           <w:szCs w:val="26"/>
-        </w:rPr>
-      </w:pPr>
-      <w:r>
-        <w:rPr>
-          <w:rFonts w:ascii="Times New Roman" w:hAnsi="Times New Roman" w:cs="Times New Roman"/>
-          <w:sz w:val="26"/>
-          <w:szCs w:val="26"/>
+          <w:lang w:val="pt-BR"/>
+        </w:rPr>
+      </w:pPr>
+      <w:r>
+        <w:rPr>
+          <w:rFonts w:ascii="Times New Roman" w:hAnsi="Times New Roman" w:cs="Times New Roman"/>
+          <w:sz w:val="26"/>
+          <w:szCs w:val="26"/>
+          <w:lang w:val="pt-BR"/>
         </w:rPr>
         <w:t>Đổi chế độ Liên tục: Da Nhan MD=1 (CONTINUOUS)\r\n</w:t>
       </w:r>
     </w:p>
     <w:p>
       <w:pPr>
+        <w:numPr>
+          <w:ilvl w:val="0"/>
+          <w:numId w:val="7"/>
+        </w:numPr>
+        <w:jc w:val="both"/>
         <w:rPr>
           <w:rFonts w:ascii="Times New Roman" w:hAnsi="Times New Roman" w:cs="Times New Roman"/>
           <w:b/>
           <w:bCs/>
           <w:sz w:val="26"/>
           <w:szCs w:val="26"/>
-        </w:rPr>
-      </w:pPr>
-      <w:r>
+          <w:lang w:val="pt-BR"/>
+        </w:rPr>
+      </w:pPr>
+    </w:p>
+    <w:p>
+      <w:pPr>
         <w:rPr>
           <w:rFonts w:ascii="Times New Roman" w:hAnsi="Times New Roman" w:cs="Times New Roman"/>
           <w:b/>
           <w:bCs/>
           <w:sz w:val="26"/>
           <w:szCs w:val="26"/>
-        </w:rPr>
-        <w:lastRenderedPageBreak/>
-        <w:t xml:space="preserve">II. </w:t>
-      </w:r>
+          <w:lang w:val="pt-BR"/>
+        </w:rPr>
+      </w:pPr>
       <w:r>
         <w:rPr>
           <w:rFonts w:ascii="Times New Roman" w:hAnsi="Times New Roman" w:cs="Times New Roman"/>
@@ -2955,8 +3466,9 @@
           <w:bCs/>
           <w:sz w:val="26"/>
           <w:szCs w:val="26"/>
-        </w:rPr>
-        <w:t>C</w:t>
+          <w:lang w:val="pt-BR"/>
+        </w:rPr>
+        <w:t xml:space="preserve">II. </w:t>
       </w:r>
       <w:r>
         <w:rPr>
@@ -2965,6 +3477,18 @@
           <w:bCs/>
           <w:sz w:val="26"/>
           <w:szCs w:val="26"/>
+          <w:lang w:val="pt-BR"/>
+        </w:rPr>
+        <w:t>C</w:t>
+      </w:r>
+      <w:r>
+        <w:rPr>
+          <w:rFonts w:ascii="Times New Roman" w:hAnsi="Times New Roman" w:cs="Times New Roman"/>
+          <w:b/>
+          <w:bCs/>
+          <w:sz w:val="26"/>
+          <w:szCs w:val="26"/>
+          <w:lang w:val="pt-BR"/>
         </w:rPr>
         <w:t>ấu trúc bản tin chuẩn Modbus RTU máy hút ẩm qua cổng RS485.</w:t>
       </w:r>
@@ -3908,6 +4432,7 @@
                 <w:sz w:val="26"/>
                 <w:szCs w:val="26"/>
               </w:rPr>
+              <w:lastRenderedPageBreak/>
               <w:t>CRC16 LO</w:t>
             </w:r>
           </w:p>
@@ -4087,13 +4612,15 @@
                 <w:rFonts w:ascii="Times New Roman" w:hAnsi="Times New Roman" w:cs="Times New Roman"/>
                 <w:sz w:val="26"/>
                 <w:szCs w:val="26"/>
-              </w:rPr>
-            </w:pPr>
-            <w:r>
-              <w:rPr>
-                <w:rFonts w:ascii="Times New Roman" w:hAnsi="Times New Roman" w:cs="Times New Roman"/>
-                <w:sz w:val="26"/>
-                <w:szCs w:val="26"/>
+                <w:lang w:val="pt-BR"/>
+              </w:rPr>
+            </w:pPr>
+            <w:r>
+              <w:rPr>
+                <w:rFonts w:ascii="Times New Roman" w:hAnsi="Times New Roman" w:cs="Times New Roman"/>
+                <w:sz w:val="26"/>
+                <w:szCs w:val="26"/>
+                <w:lang w:val="pt-BR"/>
               </w:rPr>
               <w:t>Byte cao mã kiểm tra lỗi CRC-16</w:t>
             </w:r>
@@ -4107,6 +4634,7 @@
           <w:rFonts w:ascii="Times New Roman" w:hAnsi="Times New Roman" w:cs="Times New Roman"/>
           <w:sz w:val="26"/>
           <w:szCs w:val="26"/>
+          <w:lang w:val="pt-BR"/>
         </w:rPr>
       </w:pPr>
       <w:r>
@@ -4116,6 +4644,7 @@
           <w:bCs/>
           <w:sz w:val="26"/>
           <w:szCs w:val="26"/>
+          <w:lang w:val="pt-BR"/>
         </w:rPr>
         <w:t>Chuỗi HEX truyền đi đầy đủ:</w:t>
       </w:r>
@@ -4239,7 +4768,6 @@
                 <w:sz w:val="26"/>
                 <w:szCs w:val="26"/>
               </w:rPr>
-              <w:lastRenderedPageBreak/>
               <w:t>Byte</w:t>
             </w:r>
           </w:p>
@@ -5590,6 +6118,7 @@
                 <w:sz w:val="26"/>
                 <w:szCs w:val="26"/>
               </w:rPr>
+              <w:lastRenderedPageBreak/>
               <w:t>13 - 14</w:t>
             </w:r>
           </w:p>
@@ -6164,7 +6693,6 @@
           <w:sz w:val="26"/>
           <w:szCs w:val="26"/>
         </w:rPr>
-        <w:lastRenderedPageBreak/>
         <w:t>Bit 0</w:t>
       </w:r>
       <w:r>
@@ -6619,6 +7147,7 @@
           <w:sz w:val="26"/>
           <w:szCs w:val="26"/>
         </w:rPr>
+        <w:lastRenderedPageBreak/>
         <w:t>00 0</w:t>
       </w:r>
       <w:r>
@@ -6716,6 +7245,7 @@
           <w:bCs/>
           <w:sz w:val="26"/>
           <w:szCs w:val="26"/>
+          <w:lang w:val="pt-BR"/>
         </w:rPr>
         <w:t>38B5</w:t>
       </w:r>
@@ -6724,6 +7254,7 @@
           <w:rFonts w:ascii="Times New Roman" w:hAnsi="Times New Roman" w:cs="Times New Roman"/>
           <w:sz w:val="26"/>
           <w:szCs w:val="26"/>
+          <w:lang w:val="pt-BR"/>
         </w:rPr>
         <w:t>: Mã kiểm tra lỗi CRC-16.</w:t>
       </w:r>
@@ -6732,8 +7263,17 @@
           <w:rFonts w:ascii="Times New Roman" w:hAnsi="Times New Roman" w:cs="Times New Roman"/>
           <w:sz w:val="26"/>
           <w:szCs w:val="26"/>
-        </w:rPr>
-        <w:t xml:space="preserve"> ByteThấp - byteCao</w:t>
+          <w:lang w:val="pt-BR"/>
+        </w:rPr>
+        <w:t xml:space="preserve"> </w:t>
+      </w:r>
+      <w:r>
+        <w:rPr>
+          <w:rFonts w:ascii="Times New Roman" w:hAnsi="Times New Roman" w:cs="Times New Roman"/>
+          <w:sz w:val="26"/>
+          <w:szCs w:val="26"/>
+        </w:rPr>
+        <w:t>ByteThấp - byteCao</w:t>
       </w:r>
     </w:p>
     <w:p>
@@ -7083,7 +7623,6 @@
           <w:sz w:val="26"/>
           <w:szCs w:val="26"/>
         </w:rPr>
-        <w:lastRenderedPageBreak/>
         <w:t>Byte Count: 4 (0x04)</w:t>
       </w:r>
     </w:p>
@@ -7099,6 +7638,7 @@
           <w:bCs/>
           <w:sz w:val="26"/>
           <w:szCs w:val="26"/>
+          <w:lang w:val="pt-BR"/>
         </w:rPr>
       </w:pPr>
       <w:r>
@@ -7108,6 +7648,7 @@
           <w:bCs/>
           <w:sz w:val="26"/>
           <w:szCs w:val="26"/>
+          <w:lang w:val="pt-BR"/>
         </w:rPr>
         <w:t xml:space="preserve">Data 1 (Ghi Reg 3 = </w:t>
       </w:r>
@@ -7121,7 +7662,42 @@
             <w:sz w:val="26"/>
             <w:szCs w:val="26"/>
           </w:rPr>
-          <m:t>60.0%</m:t>
+          <m:t>60</m:t>
+        </m:r>
+        <m:r>
+          <m:rPr>
+            <m:sty m:val="bi"/>
+          </m:rPr>
+          <w:rPr>
+            <w:rFonts w:ascii="Cambria Math" w:hAnsi="Cambria Math" w:cs="Times New Roman"/>
+            <w:sz w:val="26"/>
+            <w:szCs w:val="26"/>
+            <w:lang w:val="pt-BR"/>
+          </w:rPr>
+          <m:t>.</m:t>
+        </m:r>
+        <m:r>
+          <m:rPr>
+            <m:sty m:val="bi"/>
+          </m:rPr>
+          <w:rPr>
+            <w:rFonts w:ascii="Cambria Math" w:hAnsi="Cambria Math" w:cs="Times New Roman"/>
+            <w:sz w:val="26"/>
+            <w:szCs w:val="26"/>
+          </w:rPr>
+          <m:t>0</m:t>
+        </m:r>
+        <m:r>
+          <m:rPr>
+            <m:sty m:val="bi"/>
+          </m:rPr>
+          <w:rPr>
+            <w:rFonts w:ascii="Cambria Math" w:hAnsi="Cambria Math" w:cs="Times New Roman"/>
+            <w:sz w:val="26"/>
+            <w:szCs w:val="26"/>
+            <w:lang w:val="pt-BR"/>
+          </w:rPr>
+          <m:t>%</m:t>
         </m:r>
       </m:oMath>
       <w:r>
@@ -7131,6 +7707,7 @@
           <w:bCs/>
           <w:sz w:val="26"/>
           <w:szCs w:val="26"/>
+          <w:lang w:val="pt-BR"/>
         </w:rPr>
         <w:t>): 600 (0x0258)</w:t>
       </w:r>
@@ -7147,6 +7724,7 @@
           <w:bCs/>
           <w:sz w:val="26"/>
           <w:szCs w:val="26"/>
+          <w:lang w:val="pt-BR"/>
         </w:rPr>
       </w:pPr>
       <w:r>
@@ -7156,6 +7734,7 @@
           <w:bCs/>
           <w:sz w:val="26"/>
           <w:szCs w:val="26"/>
+          <w:lang w:val="pt-BR"/>
         </w:rPr>
         <w:t xml:space="preserve">Data 2 (Ghi Reg 4 = </w:t>
       </w:r>
@@ -7182,7 +7761,30 @@
                 <w:sz w:val="26"/>
                 <w:szCs w:val="26"/>
               </w:rPr>
-              <m:t>28.0</m:t>
+              <m:t>28</m:t>
+            </m:r>
+            <m:r>
+              <m:rPr>
+                <m:sty m:val="bi"/>
+              </m:rPr>
+              <w:rPr>
+                <w:rFonts w:ascii="Cambria Math" w:hAnsi="Cambria Math" w:cs="Times New Roman"/>
+                <w:sz w:val="26"/>
+                <w:szCs w:val="26"/>
+                <w:lang w:val="pt-BR"/>
+              </w:rPr>
+              <m:t>.</m:t>
+            </m:r>
+            <m:r>
+              <m:rPr>
+                <m:sty m:val="bi"/>
+              </m:rPr>
+              <w:rPr>
+                <w:rFonts w:ascii="Cambria Math" w:hAnsi="Cambria Math" w:cs="Times New Roman"/>
+                <w:sz w:val="26"/>
+                <w:szCs w:val="26"/>
+              </w:rPr>
+              <m:t>0</m:t>
             </m:r>
           </m:e>
           <m:sup>
@@ -7194,6 +7796,7 @@
                 <w:rFonts w:ascii="Cambria Math" w:hAnsi="Cambria Math" w:cs="Times New Roman"/>
                 <w:sz w:val="26"/>
                 <w:szCs w:val="26"/>
+                <w:lang w:val="pt-BR"/>
               </w:rPr>
               <m:t>∘</m:t>
             </m:r>
@@ -7209,6 +7812,7 @@
             <w:bCs/>
             <w:sz w:val="26"/>
             <w:szCs w:val="26"/>
+            <w:lang w:val="pt-BR"/>
           </w:rPr>
           <m:t>C</m:t>
         </m:r>
@@ -7220,6 +7824,7 @@
           <w:bCs/>
           <w:sz w:val="26"/>
           <w:szCs w:val="26"/>
+          <w:lang w:val="pt-BR"/>
         </w:rPr>
         <w:t>): 280 (0x0118)</w:t>
       </w:r>
@@ -7500,7 +8105,9 @@
           <w:bCs/>
           <w:sz w:val="26"/>
           <w:szCs w:val="26"/>
-        </w:rPr>
+          <w:lang w:val="pt-BR"/>
+        </w:rPr>
+        <w:lastRenderedPageBreak/>
         <w:t xml:space="preserve">3D0F </w:t>
       </w:r>
       <w:r>
@@ -7508,8 +8115,17 @@
           <w:rFonts w:ascii="Times New Roman" w:hAnsi="Times New Roman" w:cs="Times New Roman"/>
           <w:sz w:val="26"/>
           <w:szCs w:val="26"/>
-        </w:rPr>
-        <w:t>: Mã kiểm tra lỗi CRC-16. ByteThấp - byteCao</w:t>
+          <w:lang w:val="pt-BR"/>
+        </w:rPr>
+        <w:t xml:space="preserve">: Mã kiểm tra lỗi CRC-16. </w:t>
+      </w:r>
+      <w:r>
+        <w:rPr>
+          <w:rFonts w:ascii="Times New Roman" w:hAnsi="Times New Roman" w:cs="Times New Roman"/>
+          <w:sz w:val="26"/>
+          <w:szCs w:val="26"/>
+        </w:rPr>
+        <w:t>ByteThấp - byteCao</w:t>
       </w:r>
     </w:p>
     <w:p>
@@ -7541,7 +8157,7 @@
 </file>
 
 <file path=word/numbering.xml><?xml version="1.0" encoding="utf-8"?>
-<w:numbering xmlns:wpc="http://schemas.microsoft.com/office/word/2010/wordprocessingCanvas" xmlns:cx="http://schemas.microsoft.com/office/drawing/2014/chartex" xmlns:cx1="http://schemas.microsoft.com/office/drawing/2015/9/8/chartex" xmlns:cx2="http://schemas.microsoft.com/office/drawing/2015/10/21/chartex" xmlns:cx3="http://schemas.microsoft.com/office/drawing/2016/5/9/chartex" xmlns:cx4="http://schemas.microsoft.com/office/drawing/2016/5/10/chartex" xmlns:cx5="http://schemas.microsoft.com/office/drawing/2016/5/11/chartex" xmlns:cx6="http://schemas.microsoft.com/office/drawing/2016/5/12/chartex" xmlns:cx7="http://schemas.microsoft.com/office/drawing/2016/5/13/chartex" xmlns:cx8="http://schemas.microsoft.com/office/drawing/2016/5/14/chartex" xmlns:mc="http://schemas.openxmlformats.org/markup-compatibility/2006" xmlns:aink="http://schemas.microsoft.com/office/drawing/2016/ink" xmlns:am3d="http://schemas.microsoft.com/office/drawing/2017/model3d" xmlns:o="urn:schemas-microsoft-com:office:office" xmlns:oel="http://schemas.microsoft.com/office/2019/extlst" xmlns:r="http://schemas.openxmlformats.org/officeDocument/2006/relationships" xmlns:m="http://schemas.openxmlformats.org/officeDocument/2006/math" xmlns:v="urn:schemas-microsoft-com:vml" xmlns:wp14="http://schemas.microsoft.com/office/word/2010/wordprocessingDrawing" xmlns:wp="http://schemas.openxmlformats.org/drawingml/2006/wordprocessingDrawing" xmlns:w10="urn:schemas-microsoft-com:office:word" xmlns:w="http://schemas.openxmlformats.org/wordprocessingml/2006/main" xmlns:w14="http://schemas.microsoft.com/office/word/2010/wordml" xmlns:w15="http://schemas.microsoft.com/office/word/2012/wordml" xmlns:w16cei="http://schemas.microsoft.com/office/word/2026/wordml/cei" xmlns:w16cex="http://schemas.microsoft.com/office/word/2018/wordml/cex" xmlns:w16cid="http://schemas.microsoft.com/office/word/2016/wordml/cid" xmlns:w16="http://schemas.microsoft.com/office/word/2018/wordml" xmlns:w16du="http://schemas.microsoft.com/office/word/2023/wordml/word16du" xmlns:w16sdtdh="http://schemas.microsoft.com/office/word/2020/wordml/sdtdatahash" xmlns:w16sdtfl="http://schemas.microsoft.com/office/word/2024/wordml/sdtformatlock" xmlns:w16se="http://schemas.microsoft.com/office/word/2015/wordml/symex" xmlns:wpg="http://schemas.microsoft.com/office/word/2010/wordprocessingGroup" xmlns:wpi="http://schemas.microsoft.com/office/word/2010/wordprocessingInk" xmlns:wne="http://schemas.microsoft.com/office/word/2006/wordml" xmlns:wps="http://schemas.microsoft.com/office/word/2010/wordprocessingShape" mc:Ignorable="w14 w15 w16se w16cid w16 w16cex w16sdtdh w16sdtfl w16du wp14">
+<w:numbering xmlns:wpc="http://schemas.microsoft.com/office/word/2010/wordprocessingCanvas" xmlns:cx="http://schemas.microsoft.com/office/drawing/2014/chartex" xmlns:cx1="http://schemas.microsoft.com/office/drawing/2015/9/8/chartex" xmlns:cx2="http://schemas.microsoft.com/office/drawing/2015/10/21/chartex" xmlns:cx3="http://schemas.microsoft.com/office/drawing/2016/5/9/chartex" xmlns:cx4="http://schemas.microsoft.com/office/drawing/2016/5/10/chartex" xmlns:cx5="http://schemas.microsoft.com/office/drawing/2016/5/11/chartex" xmlns:cx6="http://schemas.microsoft.com/office/drawing/2016/5/12/chartex" xmlns:cx7="http://schemas.microsoft.com/office/drawing/2016/5/13/chartex" xmlns:cx8="http://schemas.microsoft.com/office/drawing/2016/5/14/chartex" xmlns:mc="http://schemas.openxmlformats.org/markup-compatibility/2006" xmlns:aink="http://schemas.microsoft.com/office/drawing/2016/ink" xmlns:am3d="http://schemas.microsoft.com/office/drawing/2017/model3d" xmlns:o="urn:schemas-microsoft-com:office:office" xmlns:oel="http://schemas.microsoft.com/office/2019/extlst" xmlns:r="http://schemas.openxmlformats.org/officeDocument/2006/relationships" xmlns:m="http://schemas.openxmlformats.org/officeDocument/2006/math" xmlns:v="urn:schemas-microsoft-com:vml" xmlns:wp14="http://schemas.microsoft.com/office/word/2010/wordprocessingDrawing" xmlns:wp="http://schemas.openxmlformats.org/drawingml/2006/wordprocessingDrawing" xmlns:w10="urn:schemas-microsoft-com:office:word" xmlns:w="http://schemas.openxmlformats.org/wordprocessingml/2006/main" xmlns:w14="http://schemas.microsoft.com/office/word/2010/wordml" xmlns:w15="http://schemas.microsoft.com/office/word/2012/wordml" xmlns:w16cex="http://schemas.microsoft.com/office/word/2018/wordml/cex" xmlns:w16cid="http://schemas.microsoft.com/office/word/2016/wordml/cid" xmlns:w16="http://schemas.microsoft.com/office/word/2018/wordml" xmlns:w16sdtdh="http://schemas.microsoft.com/office/word/2020/wordml/sdtdatahash" xmlns:w16se="http://schemas.microsoft.com/office/word/2015/wordml/symex" xmlns:wpg="http://schemas.microsoft.com/office/word/2010/wordprocessingGroup" xmlns:wpi="http://schemas.microsoft.com/office/word/2010/wordprocessingInk" xmlns:wne="http://schemas.microsoft.com/office/word/2006/wordml" xmlns:wps="http://schemas.microsoft.com/office/word/2010/wordprocessingShape" mc:Ignorable="w14 w15 w16se w16cid w16 w16cex w16sdtdh wp14">
   <w:abstractNum w:abstractNumId="0" w15:restartNumberingAfterBreak="0">
     <w:nsid w:val="04C05F26"/>
     <w:multiLevelType w:val="multilevel"/>
@@ -9462,7 +10078,7 @@
 </file>
 
 <file path=word/styles.xml><?xml version="1.0" encoding="utf-8"?>
-<w:styles xmlns:mc="http://schemas.openxmlformats.org/markup-compatibility/2006" xmlns:r="http://schemas.openxmlformats.org/officeDocument/2006/relationships" xmlns:w="http://schemas.openxmlformats.org/wordprocessingml/2006/main" xmlns:w14="http://schemas.microsoft.com/office/word/2010/wordml" xmlns:w15="http://schemas.microsoft.com/office/word/2012/wordml" xmlns:w16cex="http://schemas.microsoft.com/office/word/2018/wordml/cex" xmlns:w16cid="http://schemas.microsoft.com/office/word/2016/wordml/cid" xmlns:w16="http://schemas.microsoft.com/office/word/2018/wordml" xmlns:w16du="http://schemas.microsoft.com/office/word/2023/wordml/word16du" xmlns:w16sdtdh="http://schemas.microsoft.com/office/word/2020/wordml/sdtdatahash" xmlns:w16sdtfl="http://schemas.microsoft.com/office/word/2024/wordml/sdtformatlock" xmlns:w16se="http://schemas.microsoft.com/office/word/2015/wordml/symex" mc:Ignorable="w14 w15 w16se w16cid w16 w16cex w16sdtdh w16sdtfl w16du">
+<w:styles xmlns:mc="http://schemas.openxmlformats.org/markup-compatibility/2006" xmlns:r="http://schemas.openxmlformats.org/officeDocument/2006/relationships" xmlns:w="http://schemas.openxmlformats.org/wordprocessingml/2006/main" xmlns:w14="http://schemas.microsoft.com/office/word/2010/wordml" xmlns:w15="http://schemas.microsoft.com/office/word/2012/wordml" xmlns:w16cex="http://schemas.microsoft.com/office/word/2018/wordml/cex" xmlns:w16cid="http://schemas.microsoft.com/office/word/2016/wordml/cid" xmlns:w16="http://schemas.microsoft.com/office/word/2018/wordml" xmlns:w16sdtdh="http://schemas.microsoft.com/office/word/2020/wordml/sdtdatahash" xmlns:w16se="http://schemas.microsoft.com/office/word/2015/wordml/symex" mc:Ignorable="w14 w15 w16se w16cid w16 w16cex w16sdtdh">
   <w:docDefaults>
     <w:rPrDefault>
       <w:rPr>
@@ -10064,7 +10680,6 @@
   <w:style w:type="character" w:default="1" w:styleId="DefaultParagraphFont">
     <w:name w:val="Default Paragraph Font"/>
     <w:uiPriority w:val="1"/>
-    <w:semiHidden/>
     <w:unhideWhenUsed/>
   </w:style>
   <w:style w:type="table" w:default="1" w:styleId="TableNormal">

</xml_diff>